<commit_message>
Add sample output screens for Q1a, Q3 and Q5
Co-Authored-By: Claude Sonnet 5.5 <noreply@anthropic.com>
Claude-Session: https://claude.ai/code/session_01Q9kcvn3Nryhx1iVb28HWfw
</commit_message>
<xml_diff>
--- a/nmims-mad/Mobile_App_Development_Assignment.docx
+++ b/nmims-mad/Mobile_App_Development_Assignment.docx
@@ -2243,6 +2243,65 @@
     </w:p>
     <w:p>
       <w:pPr>
+        <w:spacing w:after="120" w:line="300"/>
+      </w:pPr>
+      <w:r>
+        <w:rPr>
+          <w:rFonts w:ascii="Calibri" w:cs="Calibri" w:eastAsia="Calibri" w:hAnsi="Calibri"/>
+          <w:sz w:val="24"/>
+          <w:szCs w:val="24"/>
+        </w:rPr>
+        <w:t xml:space="preserve">Output:</w:t>
+      </w:r>
+    </w:p>
+    <w:p>
+      <w:pPr>
+        <w:spacing w:after="120" w:before="120"/>
+        <w:jc w:val="left"/>
+      </w:pPr>
+      <w:r>
+        <w:drawing>
+          <wp:inline distT="0" distB="0" distL="0" distR="0">
+            <wp:extent cx="2095500" cy="3724275"/>
+            <wp:effectExtent t="0" r="0" b="0" l="0"/>
+            <wp:docPr id="1" name="a.png" descr="Output screen" title="Output"/>
+            <wp:cNvGraphicFramePr>
+              <a:graphicFrameLocks xmlns:a="http://schemas.openxmlformats.org/drawingml/2006/main" noChangeAspect="1"/>
+            </wp:cNvGraphicFramePr>
+            <a:graphic xmlns:a="http://schemas.openxmlformats.org/drawingml/2006/main">
+              <a:graphicData uri="http://schemas.openxmlformats.org/drawingml/2006/picture">
+                <pic:pic xmlns:pic="http://schemas.openxmlformats.org/drawingml/2006/picture">
+                  <pic:nvPicPr>
+                    <pic:cNvPr id="0" name="" descr=""/>
+                    <pic:cNvPicPr>
+                      <a:picLocks noChangeAspect="1" noChangeArrowheads="1"/>
+                    </pic:cNvPicPr>
+                  </pic:nvPicPr>
+                  <pic:blipFill>
+                    <a:blip r:embed="rId7" cstate="none"/>
+                    <a:srcRect/>
+                    <a:stretch>
+                      <a:fillRect/>
+                    </a:stretch>
+                  </pic:blipFill>
+                  <pic:spPr bwMode="auto">
+                    <a:xfrm>
+                      <a:off x="0" y="0"/>
+                      <a:ext cx="2095500" cy="3724275"/>
+                    </a:xfrm>
+                    <a:prstGeom prst="rect">
+                      <a:avLst/>
+                    </a:prstGeom>
+                  </pic:spPr>
+                </pic:pic>
+              </a:graphicData>
+            </a:graphic>
+          </wp:inline>
+        </w:drawing>
+      </w:r>
+    </w:p>
+    <w:p>
+      <w:pPr>
         <w:keepNext/>
         <w:spacing w:after="160" w:before="360"/>
       </w:pPr>
@@ -5931,6 +5990,65 @@
     </w:p>
     <w:p>
       <w:pPr>
+        <w:spacing w:after="120" w:line="300"/>
+      </w:pPr>
+      <w:r>
+        <w:rPr>
+          <w:rFonts w:ascii="Calibri" w:cs="Calibri" w:eastAsia="Calibri" w:hAnsi="Calibri"/>
+          <w:sz w:val="24"/>
+          <w:szCs w:val="24"/>
+        </w:rPr>
+        <w:t xml:space="preserve">Output:</w:t>
+      </w:r>
+    </w:p>
+    <w:p>
+      <w:pPr>
+        <w:spacing w:after="120" w:before="120"/>
+        <w:jc w:val="left"/>
+      </w:pPr>
+      <w:r>
+        <w:drawing>
+          <wp:inline distT="0" distB="0" distL="0" distR="0">
+            <wp:extent cx="2095500" cy="3724275"/>
+            <wp:effectExtent t="0" r="0" b="0" l="0"/>
+            <wp:docPr id="1" name="b.png" descr="Output screen" title="Output"/>
+            <wp:cNvGraphicFramePr>
+              <a:graphicFrameLocks xmlns:a="http://schemas.openxmlformats.org/drawingml/2006/main" noChangeAspect="1"/>
+            </wp:cNvGraphicFramePr>
+            <a:graphic xmlns:a="http://schemas.openxmlformats.org/drawingml/2006/main">
+              <a:graphicData uri="http://schemas.openxmlformats.org/drawingml/2006/picture">
+                <pic:pic xmlns:pic="http://schemas.openxmlformats.org/drawingml/2006/picture">
+                  <pic:nvPicPr>
+                    <pic:cNvPr id="0" name="" descr=""/>
+                    <pic:cNvPicPr>
+                      <a:picLocks noChangeAspect="1" noChangeArrowheads="1"/>
+                    </pic:cNvPicPr>
+                  </pic:nvPicPr>
+                  <pic:blipFill>
+                    <a:blip r:embed="rId8" cstate="none"/>
+                    <a:srcRect/>
+                    <a:stretch>
+                      <a:fillRect/>
+                    </a:stretch>
+                  </pic:blipFill>
+                  <pic:spPr bwMode="auto">
+                    <a:xfrm>
+                      <a:off x="0" y="0"/>
+                      <a:ext cx="2095500" cy="3724275"/>
+                    </a:xfrm>
+                    <a:prstGeom prst="rect">
+                      <a:avLst/>
+                    </a:prstGeom>
+                  </pic:spPr>
+                </pic:pic>
+              </a:graphicData>
+            </a:graphic>
+          </wp:inline>
+        </w:drawing>
+      </w:r>
+    </w:p>
+    <w:p>
+      <w:pPr>
         <w:keepNext/>
         <w:spacing w:after="160" w:before="360"/>
       </w:pPr>
@@ -7802,6 +7920,65 @@
           <w:szCs w:val="24"/>
         </w:rPr>
         <w:t xml:space="preserve"/>
+      </w:r>
+    </w:p>
+    <w:p>
+      <w:pPr>
+        <w:spacing w:after="120" w:line="300"/>
+      </w:pPr>
+      <w:r>
+        <w:rPr>
+          <w:rFonts w:ascii="Calibri" w:cs="Calibri" w:eastAsia="Calibri" w:hAnsi="Calibri"/>
+          <w:sz w:val="24"/>
+          <w:szCs w:val="24"/>
+        </w:rPr>
+        <w:t xml:space="preserve">Output:</w:t>
+      </w:r>
+    </w:p>
+    <w:p>
+      <w:pPr>
+        <w:spacing w:after="120" w:before="120"/>
+        <w:jc w:val="left"/>
+      </w:pPr>
+      <w:r>
+        <w:drawing>
+          <wp:inline distT="0" distB="0" distL="0" distR="0">
+            <wp:extent cx="2095500" cy="3724275"/>
+            <wp:effectExtent t="0" r="0" b="0" l="0"/>
+            <wp:docPr id="1" name="c.png" descr="Output screen" title="Output"/>
+            <wp:cNvGraphicFramePr>
+              <a:graphicFrameLocks xmlns:a="http://schemas.openxmlformats.org/drawingml/2006/main" noChangeAspect="1"/>
+            </wp:cNvGraphicFramePr>
+            <a:graphic xmlns:a="http://schemas.openxmlformats.org/drawingml/2006/main">
+              <a:graphicData uri="http://schemas.openxmlformats.org/drawingml/2006/picture">
+                <pic:pic xmlns:pic="http://schemas.openxmlformats.org/drawingml/2006/picture">
+                  <pic:nvPicPr>
+                    <pic:cNvPr id="0" name="" descr=""/>
+                    <pic:cNvPicPr>
+                      <a:picLocks noChangeAspect="1" noChangeArrowheads="1"/>
+                    </pic:cNvPicPr>
+                  </pic:nvPicPr>
+                  <pic:blipFill>
+                    <a:blip r:embed="rId9" cstate="none"/>
+                    <a:srcRect/>
+                    <a:stretch>
+                      <a:fillRect/>
+                    </a:stretch>
+                  </pic:blipFill>
+                  <pic:spPr bwMode="auto">
+                    <a:xfrm>
+                      <a:off x="0" y="0"/>
+                      <a:ext cx="2095500" cy="3724275"/>
+                    </a:xfrm>
+                    <a:prstGeom prst="rect">
+                      <a:avLst/>
+                    </a:prstGeom>
+                  </pic:spPr>
+                </pic:pic>
+              </a:graphicData>
+            </a:graphic>
+          </wp:inline>
+        </w:drawing>
       </w:r>
     </w:p>
     <w:sectPr>

</xml_diff>

<commit_message>
Restyle sample output screens like Android Studio emulator
Co-Authored-By: Claude Sonnet 5.5 <noreply@anthropic.com>
Claude-Session: https://claude.ai/code/session_01Q9kcvn3Nryhx1iVb28HWfw
</commit_message>
<xml_diff>
--- a/nmims-mad/Mobile_App_Development_Assignment.docx
+++ b/nmims-mad/Mobile_App_Development_Assignment.docx
@@ -2262,7 +2262,7 @@
       <w:r>
         <w:drawing>
           <wp:inline distT="0" distB="0" distL="0" distR="0">
-            <wp:extent cx="2095500" cy="3724275"/>
+            <wp:extent cx="2000250" cy="4210050"/>
             <wp:effectExtent t="0" r="0" b="0" l="0"/>
             <wp:docPr id="1" name="a.png" descr="Output screen" title="Output"/>
             <wp:cNvGraphicFramePr>
@@ -2287,7 +2287,7 @@
                   <pic:spPr bwMode="auto">
                     <a:xfrm>
                       <a:off x="0" y="0"/>
-                      <a:ext cx="2095500" cy="3724275"/>
+                      <a:ext cx="2000250" cy="4210050"/>
                     </a:xfrm>
                     <a:prstGeom prst="rect">
                       <a:avLst/>
@@ -6009,7 +6009,7 @@
       <w:r>
         <w:drawing>
           <wp:inline distT="0" distB="0" distL="0" distR="0">
-            <wp:extent cx="2095500" cy="3724275"/>
+            <wp:extent cx="2000250" cy="4210050"/>
             <wp:effectExtent t="0" r="0" b="0" l="0"/>
             <wp:docPr id="1" name="b.png" descr="Output screen" title="Output"/>
             <wp:cNvGraphicFramePr>
@@ -6034,7 +6034,7 @@
                   <pic:spPr bwMode="auto">
                     <a:xfrm>
                       <a:off x="0" y="0"/>
-                      <a:ext cx="2095500" cy="3724275"/>
+                      <a:ext cx="2000250" cy="4210050"/>
                     </a:xfrm>
                     <a:prstGeom prst="rect">
                       <a:avLst/>
@@ -7943,7 +7943,7 @@
       <w:r>
         <w:drawing>
           <wp:inline distT="0" distB="0" distL="0" distR="0">
-            <wp:extent cx="2095500" cy="3724275"/>
+            <wp:extent cx="2000250" cy="4210050"/>
             <wp:effectExtent t="0" r="0" b="0" l="0"/>
             <wp:docPr id="1" name="c.png" descr="Output screen" title="Output"/>
             <wp:cNvGraphicFramePr>
@@ -7968,7 +7968,7 @@
                   <pic:spPr bwMode="auto">
                     <a:xfrm>
                       <a:off x="0" y="0"/>
-                      <a:ext cx="2095500" cy="3724275"/>
+                      <a:ext cx="2000250" cy="4210050"/>
                     </a:xfrm>
                     <a:prstGeom prst="rect">
                       <a:avLst/>

</xml_diff>

<commit_message>
Q3: change date/time output format, add stage-wise sample screens
Co-Authored-By: Claude Sonnet 5.5 <noreply@anthropic.com>
Claude-Session: https://claude.ai/code/session_01Q9kcvn3Nryhx1iVb28HWfw
</commit_message>
<xml_diff>
--- a/nmims-mad/Mobile_App_Development_Assignment.docx
+++ b/nmims-mad/Mobile_App_Development_Assignment.docx
@@ -5687,72 +5687,20 @@
           <w:sz w:val="24"/>
           <w:szCs w:val="24"/>
         </w:rPr>
-        <w:t xml:space="preserve">            String amPm = (hour &gt;= 12) ? "PM" : "AM";</w:t>
-      </w:r>
-    </w:p>
-    <w:p>
-      <w:pPr>
-        <w:spacing w:after="0" w:line="276"/>
-      </w:pPr>
-      <w:r>
-        <w:rPr>
-          <w:rFonts w:ascii="Calibri" w:cs="Calibri" w:eastAsia="Calibri" w:hAnsi="Calibri"/>
-          <w:sz w:val="24"/>
-          <w:szCs w:val="24"/>
-        </w:rPr>
-        <w:t xml:space="preserve">            int hour12 = hour % 12;</w:t>
-      </w:r>
-    </w:p>
-    <w:p>
-      <w:pPr>
-        <w:spacing w:after="0" w:line="276"/>
-      </w:pPr>
-      <w:r>
-        <w:rPr>
-          <w:rFonts w:ascii="Calibri" w:cs="Calibri" w:eastAsia="Calibri" w:hAnsi="Calibri"/>
-          <w:sz w:val="24"/>
-          <w:szCs w:val="24"/>
-        </w:rPr>
-        <w:t xml:space="preserve">            if (hour12 == 0) hour12 = 12;</w:t>
-      </w:r>
-    </w:p>
-    <w:p>
-      <w:pPr>
-        <w:spacing w:after="0" w:line="276"/>
-      </w:pPr>
-      <w:r>
-        <w:rPr>
-          <w:rFonts w:ascii="Calibri" w:cs="Calibri" w:eastAsia="Calibri" w:hAnsi="Calibri"/>
-          <w:sz w:val="24"/>
-          <w:szCs w:val="24"/>
-        </w:rPr>
-        <w:t xml:space="preserve"/>
-      </w:r>
-    </w:p>
-    <w:p>
-      <w:pPr>
-        <w:spacing w:after="0" w:line="276"/>
-      </w:pPr>
-      <w:r>
-        <w:rPr>
-          <w:rFonts w:ascii="Calibri" w:cs="Calibri" w:eastAsia="Calibri" w:hAnsi="Calibri"/>
-          <w:sz w:val="24"/>
-          <w:szCs w:val="24"/>
-        </w:rPr>
-        <w:t xml:space="preserve">            String date = day + "/" + month + "/" + year;</w:t>
-      </w:r>
-    </w:p>
-    <w:p>
-      <w:pPr>
-        <w:spacing w:after="0" w:line="276"/>
-      </w:pPr>
-      <w:r>
-        <w:rPr>
-          <w:rFonts w:ascii="Calibri" w:cs="Calibri" w:eastAsia="Calibri" w:hAnsi="Calibri"/>
-          <w:sz w:val="24"/>
-          <w:szCs w:val="24"/>
-        </w:rPr>
-        <w:t xml:space="preserve">            String time = String.format("%02d:%02d %s", hour12, minute, amPm);</w:t>
+        <w:t xml:space="preserve">            String date = String.format("%02d-%02d-%d", day, month, year);</w:t>
+      </w:r>
+    </w:p>
+    <w:p>
+      <w:pPr>
+        <w:spacing w:after="0" w:line="276"/>
+      </w:pPr>
+      <w:r>
+        <w:rPr>
+          <w:rFonts w:ascii="Calibri" w:cs="Calibri" w:eastAsia="Calibri" w:hAnsi="Calibri"/>
+          <w:sz w:val="24"/>
+          <w:szCs w:val="24"/>
+        </w:rPr>
+        <w:t xml:space="preserve">            String time = String.format("%02d:%02d", hour, minute);</w:t>
       </w:r>
     </w:p>
     <w:p>
@@ -6379,52 +6327,297 @@
         <w:t xml:space="preserve">Output:</w:t>
       </w:r>
     </w:p>
-    <w:p>
-      <w:pPr>
-        <w:spacing w:after="120" w:before="120"/>
-        <w:jc w:val="left"/>
-      </w:pPr>
-      <w:r>
-        <w:drawing>
-          <wp:inline distT="0" distB="0" distL="0" distR="0">
-            <wp:extent cx="2000250" cy="4210050"/>
-            <wp:effectExtent t="0" r="0" b="0" l="0"/>
-            <wp:docPr id="1" name="b.png" descr="Output screen" title="Output"/>
-            <wp:cNvGraphicFramePr>
-              <a:graphicFrameLocks xmlns:a="http://schemas.openxmlformats.org/drawingml/2006/main" noChangeAspect="1"/>
-            </wp:cNvGraphicFramePr>
-            <a:graphic xmlns:a="http://schemas.openxmlformats.org/drawingml/2006/main">
-              <a:graphicData uri="http://schemas.openxmlformats.org/drawingml/2006/picture">
-                <pic:pic xmlns:pic="http://schemas.openxmlformats.org/drawingml/2006/picture">
-                  <pic:nvPicPr>
-                    <pic:cNvPr id="0" name="" descr=""/>
-                    <pic:cNvPicPr>
-                      <a:picLocks noChangeAspect="1" noChangeArrowheads="1"/>
-                    </pic:cNvPicPr>
-                  </pic:nvPicPr>
-                  <pic:blipFill>
-                    <a:blip r:embed="rId13" cstate="none"/>
-                    <a:srcRect/>
-                    <a:stretch>
-                      <a:fillRect/>
-                    </a:stretch>
-                  </pic:blipFill>
-                  <pic:spPr bwMode="auto">
-                    <a:xfrm>
-                      <a:off x="0" y="0"/>
-                      <a:ext cx="2000250" cy="4210050"/>
-                    </a:xfrm>
-                    <a:prstGeom prst="rect">
-                      <a:avLst/>
-                    </a:prstGeom>
-                  </pic:spPr>
-                </pic:pic>
-              </a:graphicData>
-            </a:graphic>
-          </wp:inline>
-        </w:drawing>
-      </w:r>
-    </w:p>
+    <w:tbl>
+      <w:tblPr>
+        <w:tblW w:type="dxa" w:w="9600"/>
+        <w:tblBorders>
+          <w:top w:val="none" w:color="FFFFFF" w:sz="0"/>
+          <w:left w:val="none" w:color="FFFFFF" w:sz="0"/>
+          <w:bottom w:val="none" w:color="FFFFFF" w:sz="0"/>
+          <w:right w:val="none" w:color="FFFFFF" w:sz="0"/>
+          <w:insideH w:val="none" w:color="FFFFFF" w:sz="0"/>
+          <w:insideV w:val="none" w:color="FFFFFF" w:sz="0"/>
+        </w:tblBorders>
+      </w:tblPr>
+      <w:tblGrid>
+        <w:gridCol w:w="4800"/>
+        <w:gridCol w:w="4800"/>
+      </w:tblGrid>
+      <w:tr>
+        <w:trPr>
+          <w:cantSplit/>
+        </w:trPr>
+        <w:tc>
+          <w:tcPr>
+            <w:tcW w:type="dxa" w:w="4800"/>
+            <w:tcBorders>
+              <w:top w:val="none" w:color="FFFFFF" w:sz="0"/>
+              <w:left w:val="none" w:color="FFFFFF" w:sz="0"/>
+              <w:bottom w:val="none" w:color="FFFFFF" w:sz="0"/>
+              <w:right w:val="none" w:color="FFFFFF" w:sz="0"/>
+            </w:tcBorders>
+          </w:tcPr>
+          <w:p>
+            <w:pPr>
+              <w:spacing w:after="60" w:before="100"/>
+            </w:pPr>
+            <w:r>
+              <w:rPr>
+                <w:rFonts w:ascii="Calibri" w:cs="Calibri" w:eastAsia="Calibri" w:hAnsi="Calibri"/>
+                <w:sz w:val="20"/>
+                <w:szCs w:val="20"/>
+              </w:rPr>
+              <w:t xml:space="preserve">1. App launched</w:t>
+            </w:r>
+          </w:p>
+          <w:p>
+            <w:r>
+              <w:drawing>
+                <wp:inline distT="0" distB="0" distL="0" distR="0">
+                  <wp:extent cx="1619250" cy="3409950"/>
+                  <wp:effectExtent t="0" r="0" b="0" l="0"/>
+                  <wp:docPr id="1" name="q3_1" descr="1. App launched" title="Q3"/>
+                  <wp:cNvGraphicFramePr>
+                    <a:graphicFrameLocks xmlns:a="http://schemas.openxmlformats.org/drawingml/2006/main" noChangeAspect="1"/>
+                  </wp:cNvGraphicFramePr>
+                  <a:graphic xmlns:a="http://schemas.openxmlformats.org/drawingml/2006/main">
+                    <a:graphicData uri="http://schemas.openxmlformats.org/drawingml/2006/picture">
+                      <pic:pic xmlns:pic="http://schemas.openxmlformats.org/drawingml/2006/picture">
+                        <pic:nvPicPr>
+                          <pic:cNvPr id="0" name="" descr=""/>
+                          <pic:cNvPicPr>
+                            <a:picLocks noChangeAspect="1" noChangeArrowheads="1"/>
+                          </pic:cNvPicPr>
+                        </pic:nvPicPr>
+                        <pic:blipFill>
+                          <a:blip r:embed="rId13" cstate="none"/>
+                          <a:srcRect/>
+                          <a:stretch>
+                            <a:fillRect/>
+                          </a:stretch>
+                        </pic:blipFill>
+                        <pic:spPr bwMode="auto">
+                          <a:xfrm>
+                            <a:off x="0" y="0"/>
+                            <a:ext cx="1619250" cy="3409950"/>
+                          </a:xfrm>
+                          <a:prstGeom prst="rect">
+                            <a:avLst/>
+                          </a:prstGeom>
+                        </pic:spPr>
+                      </pic:pic>
+                    </a:graphicData>
+                  </a:graphic>
+                </wp:inline>
+              </w:drawing>
+            </w:r>
+          </w:p>
+        </w:tc>
+        <w:tc>
+          <w:tcPr>
+            <w:tcW w:type="dxa" w:w="4800"/>
+            <w:tcBorders>
+              <w:top w:val="none" w:color="FFFFFF" w:sz="0"/>
+              <w:left w:val="none" w:color="FFFFFF" w:sz="0"/>
+              <w:bottom w:val="none" w:color="FFFFFF" w:sz="0"/>
+              <w:right w:val="none" w:color="FFFFFF" w:sz="0"/>
+            </w:tcBorders>
+          </w:tcPr>
+          <w:p>
+            <w:pPr>
+              <w:spacing w:after="60" w:before="100"/>
+            </w:pPr>
+            <w:r>
+              <w:rPr>
+                <w:rFonts w:ascii="Calibri" w:cs="Calibri" w:eastAsia="Calibri" w:hAnsi="Calibri"/>
+                <w:sz w:val="20"/>
+                <w:szCs w:val="20"/>
+              </w:rPr>
+              <w:t xml:space="preserve">2. Date selected (15 Aug 2026)</w:t>
+            </w:r>
+          </w:p>
+          <w:p>
+            <w:r>
+              <w:drawing>
+                <wp:inline distT="0" distB="0" distL="0" distR="0">
+                  <wp:extent cx="1619250" cy="3409950"/>
+                  <wp:effectExtent t="0" r="0" b="0" l="0"/>
+                  <wp:docPr id="1" name="q3_2" descr="2. Date selected (15 Aug 2026)" title="Q3"/>
+                  <wp:cNvGraphicFramePr>
+                    <a:graphicFrameLocks xmlns:a="http://schemas.openxmlformats.org/drawingml/2006/main" noChangeAspect="1"/>
+                  </wp:cNvGraphicFramePr>
+                  <a:graphic xmlns:a="http://schemas.openxmlformats.org/drawingml/2006/main">
+                    <a:graphicData uri="http://schemas.openxmlformats.org/drawingml/2006/picture">
+                      <pic:pic xmlns:pic="http://schemas.openxmlformats.org/drawingml/2006/picture">
+                        <pic:nvPicPr>
+                          <pic:cNvPr id="0" name="" descr=""/>
+                          <pic:cNvPicPr>
+                            <a:picLocks noChangeAspect="1" noChangeArrowheads="1"/>
+                          </pic:cNvPicPr>
+                        </pic:nvPicPr>
+                        <pic:blipFill>
+                          <a:blip r:embed="rId14" cstate="none"/>
+                          <a:srcRect/>
+                          <a:stretch>
+                            <a:fillRect/>
+                          </a:stretch>
+                        </pic:blipFill>
+                        <pic:spPr bwMode="auto">
+                          <a:xfrm>
+                            <a:off x="0" y="0"/>
+                            <a:ext cx="1619250" cy="3409950"/>
+                          </a:xfrm>
+                          <a:prstGeom prst="rect">
+                            <a:avLst/>
+                          </a:prstGeom>
+                        </pic:spPr>
+                      </pic:pic>
+                    </a:graphicData>
+                  </a:graphic>
+                </wp:inline>
+              </w:drawing>
+            </w:r>
+          </w:p>
+        </w:tc>
+      </w:tr>
+      <w:tr>
+        <w:trPr>
+          <w:cantSplit/>
+        </w:trPr>
+        <w:tc>
+          <w:tcPr>
+            <w:tcW w:type="dxa" w:w="4800"/>
+            <w:tcBorders>
+              <w:top w:val="none" w:color="FFFFFF" w:sz="0"/>
+              <w:left w:val="none" w:color="FFFFFF" w:sz="0"/>
+              <w:bottom w:val="none" w:color="FFFFFF" w:sz="0"/>
+              <w:right w:val="none" w:color="FFFFFF" w:sz="0"/>
+            </w:tcBorders>
+          </w:tcPr>
+          <w:p>
+            <w:pPr>
+              <w:spacing w:after="60" w:before="100"/>
+            </w:pPr>
+            <w:r>
+              <w:rPr>
+                <w:rFonts w:ascii="Calibri" w:cs="Calibri" w:eastAsia="Calibri" w:hAnsi="Calibri"/>
+                <w:sz w:val="20"/>
+                <w:szCs w:val="20"/>
+              </w:rPr>
+              <w:t xml:space="preserve">3. Time selected (3:30 PM)</w:t>
+            </w:r>
+          </w:p>
+          <w:p>
+            <w:r>
+              <w:drawing>
+                <wp:inline distT="0" distB="0" distL="0" distR="0">
+                  <wp:extent cx="1619250" cy="3409950"/>
+                  <wp:effectExtent t="0" r="0" b="0" l="0"/>
+                  <wp:docPr id="1" name="q3_3" descr="3. Time selected (3:30 PM)" title="Q3"/>
+                  <wp:cNvGraphicFramePr>
+                    <a:graphicFrameLocks xmlns:a="http://schemas.openxmlformats.org/drawingml/2006/main" noChangeAspect="1"/>
+                  </wp:cNvGraphicFramePr>
+                  <a:graphic xmlns:a="http://schemas.openxmlformats.org/drawingml/2006/main">
+                    <a:graphicData uri="http://schemas.openxmlformats.org/drawingml/2006/picture">
+                      <pic:pic xmlns:pic="http://schemas.openxmlformats.org/drawingml/2006/picture">
+                        <pic:nvPicPr>
+                          <pic:cNvPr id="0" name="" descr=""/>
+                          <pic:cNvPicPr>
+                            <a:picLocks noChangeAspect="1" noChangeArrowheads="1"/>
+                          </pic:cNvPicPr>
+                        </pic:nvPicPr>
+                        <pic:blipFill>
+                          <a:blip r:embed="rId15" cstate="none"/>
+                          <a:srcRect/>
+                          <a:stretch>
+                            <a:fillRect/>
+                          </a:stretch>
+                        </pic:blipFill>
+                        <pic:spPr bwMode="auto">
+                          <a:xfrm>
+                            <a:off x="0" y="0"/>
+                            <a:ext cx="1619250" cy="3409950"/>
+                          </a:xfrm>
+                          <a:prstGeom prst="rect">
+                            <a:avLst/>
+                          </a:prstGeom>
+                        </pic:spPr>
+                      </pic:pic>
+                    </a:graphicData>
+                  </a:graphic>
+                </wp:inline>
+              </w:drawing>
+            </w:r>
+          </w:p>
+        </w:tc>
+        <w:tc>
+          <w:tcPr>
+            <w:tcW w:type="dxa" w:w="4800"/>
+            <w:tcBorders>
+              <w:top w:val="none" w:color="FFFFFF" w:sz="0"/>
+              <w:left w:val="none" w:color="FFFFFF" w:sz="0"/>
+              <w:bottom w:val="none" w:color="FFFFFF" w:sz="0"/>
+              <w:right w:val="none" w:color="FFFFFF" w:sz="0"/>
+            </w:tcBorders>
+          </w:tcPr>
+          <w:p>
+            <w:pPr>
+              <w:spacing w:after="60" w:before="100"/>
+            </w:pPr>
+            <w:r>
+              <w:rPr>
+                <w:rFonts w:ascii="Calibri" w:cs="Calibri" w:eastAsia="Calibri" w:hAnsi="Calibri"/>
+                <w:sz w:val="20"/>
+                <w:szCs w:val="20"/>
+              </w:rPr>
+              <w:t xml:space="preserve">4. After pressing Show Date and Time</w:t>
+            </w:r>
+          </w:p>
+          <w:p>
+            <w:r>
+              <w:drawing>
+                <wp:inline distT="0" distB="0" distL="0" distR="0">
+                  <wp:extent cx="1619250" cy="3409950"/>
+                  <wp:effectExtent t="0" r="0" b="0" l="0"/>
+                  <wp:docPr id="1" name="q3_4" descr="4. After pressing Show Date and Time" title="Q3"/>
+                  <wp:cNvGraphicFramePr>
+                    <a:graphicFrameLocks xmlns:a="http://schemas.openxmlformats.org/drawingml/2006/main" noChangeAspect="1"/>
+                  </wp:cNvGraphicFramePr>
+                  <a:graphic xmlns:a="http://schemas.openxmlformats.org/drawingml/2006/main">
+                    <a:graphicData uri="http://schemas.openxmlformats.org/drawingml/2006/picture">
+                      <pic:pic xmlns:pic="http://schemas.openxmlformats.org/drawingml/2006/picture">
+                        <pic:nvPicPr>
+                          <pic:cNvPr id="0" name="" descr=""/>
+                          <pic:cNvPicPr>
+                            <a:picLocks noChangeAspect="1" noChangeArrowheads="1"/>
+                          </pic:cNvPicPr>
+                        </pic:nvPicPr>
+                        <pic:blipFill>
+                          <a:blip r:embed="rId16" cstate="none"/>
+                          <a:srcRect/>
+                          <a:stretch>
+                            <a:fillRect/>
+                          </a:stretch>
+                        </pic:blipFill>
+                        <pic:spPr bwMode="auto">
+                          <a:xfrm>
+                            <a:off x="0" y="0"/>
+                            <a:ext cx="1619250" cy="3409950"/>
+                          </a:xfrm>
+                          <a:prstGeom prst="rect">
+                            <a:avLst/>
+                          </a:prstGeom>
+                        </pic:spPr>
+                      </pic:pic>
+                    </a:graphicData>
+                  </a:graphic>
+                </wp:inline>
+              </w:drawing>
+            </w:r>
+          </w:p>
+        </w:tc>
+      </w:tr>
+    </w:tbl>
     <w:p>
       <w:pPr>
         <w:keepNext/>
@@ -8337,7 +8530,7 @@
                     </pic:cNvPicPr>
                   </pic:nvPicPr>
                   <pic:blipFill>
-                    <a:blip r:embed="rId14" cstate="none"/>
+                    <a:blip r:embed="rId17" cstate="none"/>
                     <a:srcRect/>
                     <a:stretch>
                       <a:fillRect/>

</xml_diff>

<commit_message>
Q3: use DatePickerDialog and TimePickerDialog, add stage-wise sample screens
Co-Authored-By: Claude Sonnet 5.5 <noreply@anthropic.com>
Claude-Session: https://claude.ai/code/session_01Q9kcvn3Nryhx1iVb28HWfw
</commit_message>
<xml_diff>
--- a/nmims-mad/Mobile_App_Development_Assignment.docx
+++ b/nmims-mad/Mobile_App_Development_Assignment.docx
@@ -5258,6 +5258,32 @@
           <w:sz w:val="24"/>
           <w:szCs w:val="24"/>
         </w:rPr>
+        <w:t xml:space="preserve">import android.app.DatePickerDialog;</w:t>
+      </w:r>
+    </w:p>
+    <w:p>
+      <w:pPr>
+        <w:spacing w:after="0" w:line="276"/>
+      </w:pPr>
+      <w:r>
+        <w:rPr>
+          <w:rFonts w:ascii="Calibri" w:cs="Calibri" w:eastAsia="Calibri" w:hAnsi="Calibri"/>
+          <w:sz w:val="24"/>
+          <w:szCs w:val="24"/>
+        </w:rPr>
+        <w:t xml:space="preserve">import android.app.TimePickerDialog;</w:t>
+      </w:r>
+    </w:p>
+    <w:p>
+      <w:pPr>
+        <w:spacing w:after="0" w:line="276"/>
+      </w:pPr>
+      <w:r>
+        <w:rPr>
+          <w:rFonts w:ascii="Calibri" w:cs="Calibri" w:eastAsia="Calibri" w:hAnsi="Calibri"/>
+          <w:sz w:val="24"/>
+          <w:szCs w:val="24"/>
+        </w:rPr>
         <w:t xml:space="preserve">import android.os.Bundle;</w:t>
       </w:r>
     </w:p>
@@ -5284,19 +5310,6 @@
           <w:sz w:val="24"/>
           <w:szCs w:val="24"/>
         </w:rPr>
-        <w:t xml:space="preserve">import android.widget.DatePicker;</w:t>
-      </w:r>
-    </w:p>
-    <w:p>
-      <w:pPr>
-        <w:spacing w:after="0" w:line="276"/>
-      </w:pPr>
-      <w:r>
-        <w:rPr>
-          <w:rFonts w:ascii="Calibri" w:cs="Calibri" w:eastAsia="Calibri" w:hAnsi="Calibri"/>
-          <w:sz w:val="24"/>
-          <w:szCs w:val="24"/>
-        </w:rPr>
         <w:t xml:space="preserve">import android.widget.TextView;</w:t>
       </w:r>
     </w:p>
@@ -5310,7 +5323,7 @@
           <w:sz w:val="24"/>
           <w:szCs w:val="24"/>
         </w:rPr>
-        <w:t xml:space="preserve">import android.widget.TimePicker;</w:t>
+        <w:t xml:space="preserve">import android.widget.Toast;</w:t>
       </w:r>
     </w:p>
     <w:p>
@@ -5362,6 +5375,32 @@
           <w:sz w:val="24"/>
           <w:szCs w:val="24"/>
         </w:rPr>
+        <w:t xml:space="preserve">import java.util.Calendar;</w:t>
+      </w:r>
+    </w:p>
+    <w:p>
+      <w:pPr>
+        <w:spacing w:after="0" w:line="276"/>
+      </w:pPr>
+      <w:r>
+        <w:rPr>
+          <w:rFonts w:ascii="Calibri" w:cs="Calibri" w:eastAsia="Calibri" w:hAnsi="Calibri"/>
+          <w:sz w:val="24"/>
+          <w:szCs w:val="24"/>
+        </w:rPr>
+        <w:t xml:space="preserve"/>
+      </w:r>
+    </w:p>
+    <w:p>
+      <w:pPr>
+        <w:spacing w:after="0" w:line="276"/>
+      </w:pPr>
+      <w:r>
+        <w:rPr>
+          <w:rFonts w:ascii="Calibri" w:cs="Calibri" w:eastAsia="Calibri" w:hAnsi="Calibri"/>
+          <w:sz w:val="24"/>
+          <w:szCs w:val="24"/>
+        </w:rPr>
         <w:t xml:space="preserve">public class MainActivity extends AppCompatActivity {</w:t>
       </w:r>
     </w:p>
@@ -5388,46 +5427,72 @@
           <w:sz w:val="24"/>
           <w:szCs w:val="24"/>
         </w:rPr>
-        <w:t xml:space="preserve">    DatePicker datePicker;</w:t>
-      </w:r>
-    </w:p>
-    <w:p>
-      <w:pPr>
-        <w:spacing w:after="0" w:line="276"/>
-      </w:pPr>
-      <w:r>
-        <w:rPr>
-          <w:rFonts w:ascii="Calibri" w:cs="Calibri" w:eastAsia="Calibri" w:hAnsi="Calibri"/>
-          <w:sz w:val="24"/>
-          <w:szCs w:val="24"/>
-        </w:rPr>
-        <w:t xml:space="preserve">    TimePicker timePicker;</w:t>
-      </w:r>
-    </w:p>
-    <w:p>
-      <w:pPr>
-        <w:spacing w:after="0" w:line="276"/>
-      </w:pPr>
-      <w:r>
-        <w:rPr>
-          <w:rFonts w:ascii="Calibri" w:cs="Calibri" w:eastAsia="Calibri" w:hAnsi="Calibri"/>
-          <w:sz w:val="24"/>
-          <w:szCs w:val="24"/>
-        </w:rPr>
-        <w:t xml:space="preserve">    Button btnShow;</w:t>
-      </w:r>
-    </w:p>
-    <w:p>
-      <w:pPr>
-        <w:spacing w:after="0" w:line="276"/>
-      </w:pPr>
-      <w:r>
-        <w:rPr>
-          <w:rFonts w:ascii="Calibri" w:cs="Calibri" w:eastAsia="Calibri" w:hAnsi="Calibri"/>
-          <w:sz w:val="24"/>
-          <w:szCs w:val="24"/>
-        </w:rPr>
-        <w:t xml:space="preserve">    TextView tvResult;</w:t>
+        <w:t xml:space="preserve">    Button btnDate, btnTime, btnShow;</w:t>
+      </w:r>
+    </w:p>
+    <w:p>
+      <w:pPr>
+        <w:spacing w:after="0" w:line="276"/>
+      </w:pPr>
+      <w:r>
+        <w:rPr>
+          <w:rFonts w:ascii="Calibri" w:cs="Calibri" w:eastAsia="Calibri" w:hAnsi="Calibri"/>
+          <w:sz w:val="24"/>
+          <w:szCs w:val="24"/>
+        </w:rPr>
+        <w:t xml:space="preserve">    TextView tvDate, tvTime, tvResult;</w:t>
+      </w:r>
+    </w:p>
+    <w:p>
+      <w:pPr>
+        <w:spacing w:after="0" w:line="276"/>
+      </w:pPr>
+      <w:r>
+        <w:rPr>
+          <w:rFonts w:ascii="Calibri" w:cs="Calibri" w:eastAsia="Calibri" w:hAnsi="Calibri"/>
+          <w:sz w:val="24"/>
+          <w:szCs w:val="24"/>
+        </w:rPr>
+        <w:t xml:space="preserve"/>
+      </w:r>
+    </w:p>
+    <w:p>
+      <w:pPr>
+        <w:spacing w:after="0" w:line="276"/>
+      </w:pPr>
+      <w:r>
+        <w:rPr>
+          <w:rFonts w:ascii="Calibri" w:cs="Calibri" w:eastAsia="Calibri" w:hAnsi="Calibri"/>
+          <w:sz w:val="24"/>
+          <w:szCs w:val="24"/>
+        </w:rPr>
+        <w:t xml:space="preserve">    int year, month, day, hour, minute;</w:t>
+      </w:r>
+    </w:p>
+    <w:p>
+      <w:pPr>
+        <w:spacing w:after="0" w:line="276"/>
+      </w:pPr>
+      <w:r>
+        <w:rPr>
+          <w:rFonts w:ascii="Calibri" w:cs="Calibri" w:eastAsia="Calibri" w:hAnsi="Calibri"/>
+          <w:sz w:val="24"/>
+          <w:szCs w:val="24"/>
+        </w:rPr>
+        <w:t xml:space="preserve">    boolean dateSelected = false;</w:t>
+      </w:r>
+    </w:p>
+    <w:p>
+      <w:pPr>
+        <w:spacing w:after="0" w:line="276"/>
+      </w:pPr>
+      <w:r>
+        <w:rPr>
+          <w:rFonts w:ascii="Calibri" w:cs="Calibri" w:eastAsia="Calibri" w:hAnsi="Calibri"/>
+          <w:sz w:val="24"/>
+          <w:szCs w:val="24"/>
+        </w:rPr>
+        <w:t xml:space="preserve">    boolean timeSelected = false;</w:t>
       </w:r>
     </w:p>
     <w:p>
@@ -5518,20 +5583,20 @@
           <w:sz w:val="24"/>
           <w:szCs w:val="24"/>
         </w:rPr>
-        <w:t xml:space="preserve">        datePicker = findViewById(R.id.datePicker);</w:t>
-      </w:r>
-    </w:p>
-    <w:p>
-      <w:pPr>
-        <w:spacing w:after="0" w:line="276"/>
-      </w:pPr>
-      <w:r>
-        <w:rPr>
-          <w:rFonts w:ascii="Calibri" w:cs="Calibri" w:eastAsia="Calibri" w:hAnsi="Calibri"/>
-          <w:sz w:val="24"/>
-          <w:szCs w:val="24"/>
-        </w:rPr>
-        <w:t xml:space="preserve">        timePicker = findViewById(R.id.timePicker);</w:t>
+        <w:t xml:space="preserve">        btnDate = findViewById(R.id.btnDate);</w:t>
+      </w:r>
+    </w:p>
+    <w:p>
+      <w:pPr>
+        <w:spacing w:after="0" w:line="276"/>
+      </w:pPr>
+      <w:r>
+        <w:rPr>
+          <w:rFonts w:ascii="Calibri" w:cs="Calibri" w:eastAsia="Calibri" w:hAnsi="Calibri"/>
+          <w:sz w:val="24"/>
+          <w:szCs w:val="24"/>
+        </w:rPr>
+        <w:t xml:space="preserve">        btnTime = findViewById(R.id.btnTime);</w:t>
       </w:r>
     </w:p>
     <w:p>
@@ -5557,6 +5622,32 @@
           <w:sz w:val="24"/>
           <w:szCs w:val="24"/>
         </w:rPr>
+        <w:t xml:space="preserve">        tvDate = findViewById(R.id.tvDate);</w:t>
+      </w:r>
+    </w:p>
+    <w:p>
+      <w:pPr>
+        <w:spacing w:after="0" w:line="276"/>
+      </w:pPr>
+      <w:r>
+        <w:rPr>
+          <w:rFonts w:ascii="Calibri" w:cs="Calibri" w:eastAsia="Calibri" w:hAnsi="Calibri"/>
+          <w:sz w:val="24"/>
+          <w:szCs w:val="24"/>
+        </w:rPr>
+        <w:t xml:space="preserve">        tvTime = findViewById(R.id.tvTime);</w:t>
+      </w:r>
+    </w:p>
+    <w:p>
+      <w:pPr>
+        <w:spacing w:after="0" w:line="276"/>
+      </w:pPr>
+      <w:r>
+        <w:rPr>
+          <w:rFonts w:ascii="Calibri" w:cs="Calibri" w:eastAsia="Calibri" w:hAnsi="Calibri"/>
+          <w:sz w:val="24"/>
+          <w:szCs w:val="24"/>
+        </w:rPr>
         <w:t xml:space="preserve">        tvResult = findViewById(R.id.tvResult);</w:t>
       </w:r>
     </w:p>
@@ -5583,6 +5674,396 @@
           <w:sz w:val="24"/>
           <w:szCs w:val="24"/>
         </w:rPr>
+        <w:t xml:space="preserve">        Calendar now = Calendar.getInstance();</w:t>
+      </w:r>
+    </w:p>
+    <w:p>
+      <w:pPr>
+        <w:spacing w:after="0" w:line="276"/>
+      </w:pPr>
+      <w:r>
+        <w:rPr>
+          <w:rFonts w:ascii="Calibri" w:cs="Calibri" w:eastAsia="Calibri" w:hAnsi="Calibri"/>
+          <w:sz w:val="24"/>
+          <w:szCs w:val="24"/>
+        </w:rPr>
+        <w:t xml:space="preserve">        year = now.get(Calendar.YEAR);</w:t>
+      </w:r>
+    </w:p>
+    <w:p>
+      <w:pPr>
+        <w:spacing w:after="0" w:line="276"/>
+      </w:pPr>
+      <w:r>
+        <w:rPr>
+          <w:rFonts w:ascii="Calibri" w:cs="Calibri" w:eastAsia="Calibri" w:hAnsi="Calibri"/>
+          <w:sz w:val="24"/>
+          <w:szCs w:val="24"/>
+        </w:rPr>
+        <w:t xml:space="preserve">        month = now.get(Calendar.MONTH);</w:t>
+      </w:r>
+    </w:p>
+    <w:p>
+      <w:pPr>
+        <w:spacing w:after="0" w:line="276"/>
+      </w:pPr>
+      <w:r>
+        <w:rPr>
+          <w:rFonts w:ascii="Calibri" w:cs="Calibri" w:eastAsia="Calibri" w:hAnsi="Calibri"/>
+          <w:sz w:val="24"/>
+          <w:szCs w:val="24"/>
+        </w:rPr>
+        <w:t xml:space="preserve">        day = now.get(Calendar.DAY_OF_MONTH);</w:t>
+      </w:r>
+    </w:p>
+    <w:p>
+      <w:pPr>
+        <w:spacing w:after="0" w:line="276"/>
+      </w:pPr>
+      <w:r>
+        <w:rPr>
+          <w:rFonts w:ascii="Calibri" w:cs="Calibri" w:eastAsia="Calibri" w:hAnsi="Calibri"/>
+          <w:sz w:val="24"/>
+          <w:szCs w:val="24"/>
+        </w:rPr>
+        <w:t xml:space="preserve">        hour = now.get(Calendar.HOUR_OF_DAY);</w:t>
+      </w:r>
+    </w:p>
+    <w:p>
+      <w:pPr>
+        <w:spacing w:after="0" w:line="276"/>
+      </w:pPr>
+      <w:r>
+        <w:rPr>
+          <w:rFonts w:ascii="Calibri" w:cs="Calibri" w:eastAsia="Calibri" w:hAnsi="Calibri"/>
+          <w:sz w:val="24"/>
+          <w:szCs w:val="24"/>
+        </w:rPr>
+        <w:t xml:space="preserve">        minute = now.get(Calendar.MINUTE);</w:t>
+      </w:r>
+    </w:p>
+    <w:p>
+      <w:pPr>
+        <w:spacing w:after="0" w:line="276"/>
+      </w:pPr>
+      <w:r>
+        <w:rPr>
+          <w:rFonts w:ascii="Calibri" w:cs="Calibri" w:eastAsia="Calibri" w:hAnsi="Calibri"/>
+          <w:sz w:val="24"/>
+          <w:szCs w:val="24"/>
+        </w:rPr>
+        <w:t xml:space="preserve"/>
+      </w:r>
+    </w:p>
+    <w:p>
+      <w:pPr>
+        <w:spacing w:after="0" w:line="276"/>
+      </w:pPr>
+      <w:r>
+        <w:rPr>
+          <w:rFonts w:ascii="Calibri" w:cs="Calibri" w:eastAsia="Calibri" w:hAnsi="Calibri"/>
+          <w:sz w:val="24"/>
+          <w:szCs w:val="24"/>
+        </w:rPr>
+        <w:t xml:space="preserve">        btnDate.setOnClickListener(v -&gt; {</w:t>
+      </w:r>
+    </w:p>
+    <w:p>
+      <w:pPr>
+        <w:spacing w:after="0" w:line="276"/>
+      </w:pPr>
+      <w:r>
+        <w:rPr>
+          <w:rFonts w:ascii="Calibri" w:cs="Calibri" w:eastAsia="Calibri" w:hAnsi="Calibri"/>
+          <w:sz w:val="24"/>
+          <w:szCs w:val="24"/>
+        </w:rPr>
+        <w:t xml:space="preserve">            DatePickerDialog dialog = new DatePickerDialog(this,</w:t>
+      </w:r>
+    </w:p>
+    <w:p>
+      <w:pPr>
+        <w:spacing w:after="0" w:line="276"/>
+      </w:pPr>
+      <w:r>
+        <w:rPr>
+          <w:rFonts w:ascii="Calibri" w:cs="Calibri" w:eastAsia="Calibri" w:hAnsi="Calibri"/>
+          <w:sz w:val="24"/>
+          <w:szCs w:val="24"/>
+        </w:rPr>
+        <w:t xml:space="preserve">                    (view, y, m, d) -&gt; {</w:t>
+      </w:r>
+    </w:p>
+    <w:p>
+      <w:pPr>
+        <w:spacing w:after="0" w:line="276"/>
+      </w:pPr>
+      <w:r>
+        <w:rPr>
+          <w:rFonts w:ascii="Calibri" w:cs="Calibri" w:eastAsia="Calibri" w:hAnsi="Calibri"/>
+          <w:sz w:val="24"/>
+          <w:szCs w:val="24"/>
+        </w:rPr>
+        <w:t xml:space="preserve">                        year = y;</w:t>
+      </w:r>
+    </w:p>
+    <w:p>
+      <w:pPr>
+        <w:spacing w:after="0" w:line="276"/>
+      </w:pPr>
+      <w:r>
+        <w:rPr>
+          <w:rFonts w:ascii="Calibri" w:cs="Calibri" w:eastAsia="Calibri" w:hAnsi="Calibri"/>
+          <w:sz w:val="24"/>
+          <w:szCs w:val="24"/>
+        </w:rPr>
+        <w:t xml:space="preserve">                        month = m;</w:t>
+      </w:r>
+    </w:p>
+    <w:p>
+      <w:pPr>
+        <w:spacing w:after="0" w:line="276"/>
+      </w:pPr>
+      <w:r>
+        <w:rPr>
+          <w:rFonts w:ascii="Calibri" w:cs="Calibri" w:eastAsia="Calibri" w:hAnsi="Calibri"/>
+          <w:sz w:val="24"/>
+          <w:szCs w:val="24"/>
+        </w:rPr>
+        <w:t xml:space="preserve">                        day = d;</w:t>
+      </w:r>
+    </w:p>
+    <w:p>
+      <w:pPr>
+        <w:spacing w:after="0" w:line="276"/>
+      </w:pPr>
+      <w:r>
+        <w:rPr>
+          <w:rFonts w:ascii="Calibri" w:cs="Calibri" w:eastAsia="Calibri" w:hAnsi="Calibri"/>
+          <w:sz w:val="24"/>
+          <w:szCs w:val="24"/>
+        </w:rPr>
+        <w:t xml:space="preserve">                        dateSelected = true;</w:t>
+      </w:r>
+    </w:p>
+    <w:p>
+      <w:pPr>
+        <w:spacing w:after="0" w:line="276"/>
+      </w:pPr>
+      <w:r>
+        <w:rPr>
+          <w:rFonts w:ascii="Calibri" w:cs="Calibri" w:eastAsia="Calibri" w:hAnsi="Calibri"/>
+          <w:sz w:val="24"/>
+          <w:szCs w:val="24"/>
+        </w:rPr>
+        <w:t xml:space="preserve">                        tvDate.setText("Date: " + String.format("%02d-%02d-%d", day, month + 1, year));</w:t>
+      </w:r>
+    </w:p>
+    <w:p>
+      <w:pPr>
+        <w:spacing w:after="0" w:line="276"/>
+      </w:pPr>
+      <w:r>
+        <w:rPr>
+          <w:rFonts w:ascii="Calibri" w:cs="Calibri" w:eastAsia="Calibri" w:hAnsi="Calibri"/>
+          <w:sz w:val="24"/>
+          <w:szCs w:val="24"/>
+        </w:rPr>
+        <w:t xml:space="preserve">                    }, year, month, day);</w:t>
+      </w:r>
+    </w:p>
+    <w:p>
+      <w:pPr>
+        <w:spacing w:after="0" w:line="276"/>
+      </w:pPr>
+      <w:r>
+        <w:rPr>
+          <w:rFonts w:ascii="Calibri" w:cs="Calibri" w:eastAsia="Calibri" w:hAnsi="Calibri"/>
+          <w:sz w:val="24"/>
+          <w:szCs w:val="24"/>
+        </w:rPr>
+        <w:t xml:space="preserve">            dialog.show();</w:t>
+      </w:r>
+    </w:p>
+    <w:p>
+      <w:pPr>
+        <w:spacing w:after="0" w:line="276"/>
+      </w:pPr>
+      <w:r>
+        <w:rPr>
+          <w:rFonts w:ascii="Calibri" w:cs="Calibri" w:eastAsia="Calibri" w:hAnsi="Calibri"/>
+          <w:sz w:val="24"/>
+          <w:szCs w:val="24"/>
+        </w:rPr>
+        <w:t xml:space="preserve">        });</w:t>
+      </w:r>
+    </w:p>
+    <w:p>
+      <w:pPr>
+        <w:spacing w:after="0" w:line="276"/>
+      </w:pPr>
+      <w:r>
+        <w:rPr>
+          <w:rFonts w:ascii="Calibri" w:cs="Calibri" w:eastAsia="Calibri" w:hAnsi="Calibri"/>
+          <w:sz w:val="24"/>
+          <w:szCs w:val="24"/>
+        </w:rPr>
+        <w:t xml:space="preserve"/>
+      </w:r>
+    </w:p>
+    <w:p>
+      <w:pPr>
+        <w:spacing w:after="0" w:line="276"/>
+      </w:pPr>
+      <w:r>
+        <w:rPr>
+          <w:rFonts w:ascii="Calibri" w:cs="Calibri" w:eastAsia="Calibri" w:hAnsi="Calibri"/>
+          <w:sz w:val="24"/>
+          <w:szCs w:val="24"/>
+        </w:rPr>
+        <w:t xml:space="preserve">        btnTime.setOnClickListener(v -&gt; {</w:t>
+      </w:r>
+    </w:p>
+    <w:p>
+      <w:pPr>
+        <w:spacing w:after="0" w:line="276"/>
+      </w:pPr>
+      <w:r>
+        <w:rPr>
+          <w:rFonts w:ascii="Calibri" w:cs="Calibri" w:eastAsia="Calibri" w:hAnsi="Calibri"/>
+          <w:sz w:val="24"/>
+          <w:szCs w:val="24"/>
+        </w:rPr>
+        <w:t xml:space="preserve">            TimePickerDialog dialog = new TimePickerDialog(this,</w:t>
+      </w:r>
+    </w:p>
+    <w:p>
+      <w:pPr>
+        <w:spacing w:after="0" w:line="276"/>
+      </w:pPr>
+      <w:r>
+        <w:rPr>
+          <w:rFonts w:ascii="Calibri" w:cs="Calibri" w:eastAsia="Calibri" w:hAnsi="Calibri"/>
+          <w:sz w:val="24"/>
+          <w:szCs w:val="24"/>
+        </w:rPr>
+        <w:t xml:space="preserve">                    (view, h, min) -&gt; {</w:t>
+      </w:r>
+    </w:p>
+    <w:p>
+      <w:pPr>
+        <w:spacing w:after="0" w:line="276"/>
+      </w:pPr>
+      <w:r>
+        <w:rPr>
+          <w:rFonts w:ascii="Calibri" w:cs="Calibri" w:eastAsia="Calibri" w:hAnsi="Calibri"/>
+          <w:sz w:val="24"/>
+          <w:szCs w:val="24"/>
+        </w:rPr>
+        <w:t xml:space="preserve">                        hour = h;</w:t>
+      </w:r>
+    </w:p>
+    <w:p>
+      <w:pPr>
+        <w:spacing w:after="0" w:line="276"/>
+      </w:pPr>
+      <w:r>
+        <w:rPr>
+          <w:rFonts w:ascii="Calibri" w:cs="Calibri" w:eastAsia="Calibri" w:hAnsi="Calibri"/>
+          <w:sz w:val="24"/>
+          <w:szCs w:val="24"/>
+        </w:rPr>
+        <w:t xml:space="preserve">                        minute = min;</w:t>
+      </w:r>
+    </w:p>
+    <w:p>
+      <w:pPr>
+        <w:spacing w:after="0" w:line="276"/>
+      </w:pPr>
+      <w:r>
+        <w:rPr>
+          <w:rFonts w:ascii="Calibri" w:cs="Calibri" w:eastAsia="Calibri" w:hAnsi="Calibri"/>
+          <w:sz w:val="24"/>
+          <w:szCs w:val="24"/>
+        </w:rPr>
+        <w:t xml:space="preserve">                        timeSelected = true;</w:t>
+      </w:r>
+    </w:p>
+    <w:p>
+      <w:pPr>
+        <w:spacing w:after="0" w:line="276"/>
+      </w:pPr>
+      <w:r>
+        <w:rPr>
+          <w:rFonts w:ascii="Calibri" w:cs="Calibri" w:eastAsia="Calibri" w:hAnsi="Calibri"/>
+          <w:sz w:val="24"/>
+          <w:szCs w:val="24"/>
+        </w:rPr>
+        <w:t xml:space="preserve">                        tvTime.setText("Time: " + String.format("%02d:%02d", hour, minute));</w:t>
+      </w:r>
+    </w:p>
+    <w:p>
+      <w:pPr>
+        <w:spacing w:after="0" w:line="276"/>
+      </w:pPr>
+      <w:r>
+        <w:rPr>
+          <w:rFonts w:ascii="Calibri" w:cs="Calibri" w:eastAsia="Calibri" w:hAnsi="Calibri"/>
+          <w:sz w:val="24"/>
+          <w:szCs w:val="24"/>
+        </w:rPr>
+        <w:t xml:space="preserve">                    }, hour, minute, true);</w:t>
+      </w:r>
+    </w:p>
+    <w:p>
+      <w:pPr>
+        <w:spacing w:after="0" w:line="276"/>
+      </w:pPr>
+      <w:r>
+        <w:rPr>
+          <w:rFonts w:ascii="Calibri" w:cs="Calibri" w:eastAsia="Calibri" w:hAnsi="Calibri"/>
+          <w:sz w:val="24"/>
+          <w:szCs w:val="24"/>
+        </w:rPr>
+        <w:t xml:space="preserve">            dialog.show();</w:t>
+      </w:r>
+    </w:p>
+    <w:p>
+      <w:pPr>
+        <w:spacing w:after="0" w:line="276"/>
+      </w:pPr>
+      <w:r>
+        <w:rPr>
+          <w:rFonts w:ascii="Calibri" w:cs="Calibri" w:eastAsia="Calibri" w:hAnsi="Calibri"/>
+          <w:sz w:val="24"/>
+          <w:szCs w:val="24"/>
+        </w:rPr>
+        <w:t xml:space="preserve">        });</w:t>
+      </w:r>
+    </w:p>
+    <w:p>
+      <w:pPr>
+        <w:spacing w:after="0" w:line="276"/>
+      </w:pPr>
+      <w:r>
+        <w:rPr>
+          <w:rFonts w:ascii="Calibri" w:cs="Calibri" w:eastAsia="Calibri" w:hAnsi="Calibri"/>
+          <w:sz w:val="24"/>
+          <w:szCs w:val="24"/>
+        </w:rPr>
+        <w:t xml:space="preserve"/>
+      </w:r>
+    </w:p>
+    <w:p>
+      <w:pPr>
+        <w:spacing w:after="0" w:line="276"/>
+      </w:pPr>
+      <w:r>
+        <w:rPr>
+          <w:rFonts w:ascii="Calibri" w:cs="Calibri" w:eastAsia="Calibri" w:hAnsi="Calibri"/>
+          <w:sz w:val="24"/>
+          <w:szCs w:val="24"/>
+        </w:rPr>
         <w:t xml:space="preserve">        btnShow.setOnClickListener(v -&gt; {</w:t>
       </w:r>
     </w:p>
@@ -5596,98 +6077,59 @@
           <w:sz w:val="24"/>
           <w:szCs w:val="24"/>
         </w:rPr>
-        <w:t xml:space="preserve">            int day = datePicker.getDayOfMonth();</w:t>
-      </w:r>
-    </w:p>
-    <w:p>
-      <w:pPr>
-        <w:spacing w:after="0" w:line="276"/>
-      </w:pPr>
-      <w:r>
-        <w:rPr>
-          <w:rFonts w:ascii="Calibri" w:cs="Calibri" w:eastAsia="Calibri" w:hAnsi="Calibri"/>
-          <w:sz w:val="24"/>
-          <w:szCs w:val="24"/>
-        </w:rPr>
-        <w:t xml:space="preserve">            int month = datePicker.getMonth() + 1;</w:t>
-      </w:r>
-    </w:p>
-    <w:p>
-      <w:pPr>
-        <w:spacing w:after="0" w:line="276"/>
-      </w:pPr>
-      <w:r>
-        <w:rPr>
-          <w:rFonts w:ascii="Calibri" w:cs="Calibri" w:eastAsia="Calibri" w:hAnsi="Calibri"/>
-          <w:sz w:val="24"/>
-          <w:szCs w:val="24"/>
-        </w:rPr>
-        <w:t xml:space="preserve">            int year = datePicker.getYear();</w:t>
-      </w:r>
-    </w:p>
-    <w:p>
-      <w:pPr>
-        <w:spacing w:after="0" w:line="276"/>
-      </w:pPr>
-      <w:r>
-        <w:rPr>
-          <w:rFonts w:ascii="Calibri" w:cs="Calibri" w:eastAsia="Calibri" w:hAnsi="Calibri"/>
-          <w:sz w:val="24"/>
-          <w:szCs w:val="24"/>
-        </w:rPr>
-        <w:t xml:space="preserve"/>
-      </w:r>
-    </w:p>
-    <w:p>
-      <w:pPr>
-        <w:spacing w:after="0" w:line="276"/>
-      </w:pPr>
-      <w:r>
-        <w:rPr>
-          <w:rFonts w:ascii="Calibri" w:cs="Calibri" w:eastAsia="Calibri" w:hAnsi="Calibri"/>
-          <w:sz w:val="24"/>
-          <w:szCs w:val="24"/>
-        </w:rPr>
-        <w:t xml:space="preserve">            int hour = timePicker.getHour();</w:t>
-      </w:r>
-    </w:p>
-    <w:p>
-      <w:pPr>
-        <w:spacing w:after="0" w:line="276"/>
-      </w:pPr>
-      <w:r>
-        <w:rPr>
-          <w:rFonts w:ascii="Calibri" w:cs="Calibri" w:eastAsia="Calibri" w:hAnsi="Calibri"/>
-          <w:sz w:val="24"/>
-          <w:szCs w:val="24"/>
-        </w:rPr>
-        <w:t xml:space="preserve">            int minute = timePicker.getMinute();</w:t>
-      </w:r>
-    </w:p>
-    <w:p>
-      <w:pPr>
-        <w:spacing w:after="0" w:line="276"/>
-      </w:pPr>
-      <w:r>
-        <w:rPr>
-          <w:rFonts w:ascii="Calibri" w:cs="Calibri" w:eastAsia="Calibri" w:hAnsi="Calibri"/>
-          <w:sz w:val="24"/>
-          <w:szCs w:val="24"/>
-        </w:rPr>
-        <w:t xml:space="preserve"/>
-      </w:r>
-    </w:p>
-    <w:p>
-      <w:pPr>
-        <w:spacing w:after="0" w:line="276"/>
-      </w:pPr>
-      <w:r>
-        <w:rPr>
-          <w:rFonts w:ascii="Calibri" w:cs="Calibri" w:eastAsia="Calibri" w:hAnsi="Calibri"/>
-          <w:sz w:val="24"/>
-          <w:szCs w:val="24"/>
-        </w:rPr>
-        <w:t xml:space="preserve">            String date = String.format("%02d-%02d-%d", day, month, year);</w:t>
+        <w:t xml:space="preserve">            if (!dateSelected || !timeSelected) {</w:t>
+      </w:r>
+    </w:p>
+    <w:p>
+      <w:pPr>
+        <w:spacing w:after="0" w:line="276"/>
+      </w:pPr>
+      <w:r>
+        <w:rPr>
+          <w:rFonts w:ascii="Calibri" w:cs="Calibri" w:eastAsia="Calibri" w:hAnsi="Calibri"/>
+          <w:sz w:val="24"/>
+          <w:szCs w:val="24"/>
+        </w:rPr>
+        <w:t xml:space="preserve">                Toast.makeText(this, "Please select date and time first", Toast.LENGTH_SHORT).show();</w:t>
+      </w:r>
+    </w:p>
+    <w:p>
+      <w:pPr>
+        <w:spacing w:after="0" w:line="276"/>
+      </w:pPr>
+      <w:r>
+        <w:rPr>
+          <w:rFonts w:ascii="Calibri" w:cs="Calibri" w:eastAsia="Calibri" w:hAnsi="Calibri"/>
+          <w:sz w:val="24"/>
+          <w:szCs w:val="24"/>
+        </w:rPr>
+        <w:t xml:space="preserve">                return;</w:t>
+      </w:r>
+    </w:p>
+    <w:p>
+      <w:pPr>
+        <w:spacing w:after="0" w:line="276"/>
+      </w:pPr>
+      <w:r>
+        <w:rPr>
+          <w:rFonts w:ascii="Calibri" w:cs="Calibri" w:eastAsia="Calibri" w:hAnsi="Calibri"/>
+          <w:sz w:val="24"/>
+          <w:szCs w:val="24"/>
+        </w:rPr>
+        <w:t xml:space="preserve">            }</w:t>
+      </w:r>
+    </w:p>
+    <w:p>
+      <w:pPr>
+        <w:spacing w:after="0" w:line="276"/>
+      </w:pPr>
+      <w:r>
+        <w:rPr>
+          <w:rFonts w:ascii="Calibri" w:cs="Calibri" w:eastAsia="Calibri" w:hAnsi="Calibri"/>
+          <w:sz w:val="24"/>
+          <w:szCs w:val="24"/>
+        </w:rPr>
+        <w:t xml:space="preserve">            String date = String.format("%02d-%02d-%d", day, month + 1, year);</w:t>
       </w:r>
     </w:p>
     <w:p>
@@ -5713,19 +6155,6 @@
           <w:sz w:val="24"/>
           <w:szCs w:val="24"/>
         </w:rPr>
-        <w:t xml:space="preserve"/>
-      </w:r>
-    </w:p>
-    <w:p>
-      <w:pPr>
-        <w:spacing w:after="0" w:line="276"/>
-      </w:pPr>
-      <w:r>
-        <w:rPr>
-          <w:rFonts w:ascii="Calibri" w:cs="Calibri" w:eastAsia="Calibri" w:hAnsi="Calibri"/>
-          <w:sz w:val="24"/>
-          <w:szCs w:val="24"/>
-        </w:rPr>
         <w:t xml:space="preserve">            tvResult.setText("Selected Date: " + date + "\nSelected Time: " + time);</w:t>
       </w:r>
     </w:p>
@@ -5817,7 +6246,7 @@
           <w:sz w:val="24"/>
           <w:szCs w:val="24"/>
         </w:rPr>
-        <w:t xml:space="preserve">&lt;ScrollView xmlns:android="http://schemas.android.com/apk/res/android"</w:t>
+        <w:t xml:space="preserve">&lt;LinearLayout xmlns:android="http://schemas.android.com/apk/res/android"</w:t>
       </w:r>
     </w:p>
     <w:p>
@@ -5843,33 +6272,72 @@
           <w:sz w:val="24"/>
           <w:szCs w:val="24"/>
         </w:rPr>
-        <w:t xml:space="preserve">    android:layout_height="match_parent"&gt;</w:t>
-      </w:r>
-    </w:p>
-    <w:p>
-      <w:pPr>
-        <w:spacing w:after="0" w:line="276"/>
-      </w:pPr>
-      <w:r>
-        <w:rPr>
-          <w:rFonts w:ascii="Calibri" w:cs="Calibri" w:eastAsia="Calibri" w:hAnsi="Calibri"/>
-          <w:sz w:val="24"/>
-          <w:szCs w:val="24"/>
-        </w:rPr>
-        <w:t xml:space="preserve"/>
-      </w:r>
-    </w:p>
-    <w:p>
-      <w:pPr>
-        <w:spacing w:after="0" w:line="276"/>
-      </w:pPr>
-      <w:r>
-        <w:rPr>
-          <w:rFonts w:ascii="Calibri" w:cs="Calibri" w:eastAsia="Calibri" w:hAnsi="Calibri"/>
-          <w:sz w:val="24"/>
-          <w:szCs w:val="24"/>
-        </w:rPr>
-        <w:t xml:space="preserve">    &lt;LinearLayout</w:t>
+        <w:t xml:space="preserve">    android:layout_height="match_parent"</w:t>
+      </w:r>
+    </w:p>
+    <w:p>
+      <w:pPr>
+        <w:spacing w:after="0" w:line="276"/>
+      </w:pPr>
+      <w:r>
+        <w:rPr>
+          <w:rFonts w:ascii="Calibri" w:cs="Calibri" w:eastAsia="Calibri" w:hAnsi="Calibri"/>
+          <w:sz w:val="24"/>
+          <w:szCs w:val="24"/>
+        </w:rPr>
+        <w:t xml:space="preserve">    android:orientation="vertical"</w:t>
+      </w:r>
+    </w:p>
+    <w:p>
+      <w:pPr>
+        <w:spacing w:after="0" w:line="276"/>
+      </w:pPr>
+      <w:r>
+        <w:rPr>
+          <w:rFonts w:ascii="Calibri" w:cs="Calibri" w:eastAsia="Calibri" w:hAnsi="Calibri"/>
+          <w:sz w:val="24"/>
+          <w:szCs w:val="24"/>
+        </w:rPr>
+        <w:t xml:space="preserve">    android:padding="20dp"&gt;</w:t>
+      </w:r>
+    </w:p>
+    <w:p>
+      <w:pPr>
+        <w:spacing w:after="0" w:line="276"/>
+      </w:pPr>
+      <w:r>
+        <w:rPr>
+          <w:rFonts w:ascii="Calibri" w:cs="Calibri" w:eastAsia="Calibri" w:hAnsi="Calibri"/>
+          <w:sz w:val="24"/>
+          <w:szCs w:val="24"/>
+        </w:rPr>
+        <w:t xml:space="preserve"/>
+      </w:r>
+    </w:p>
+    <w:p>
+      <w:pPr>
+        <w:spacing w:after="0" w:line="276"/>
+      </w:pPr>
+      <w:r>
+        <w:rPr>
+          <w:rFonts w:ascii="Calibri" w:cs="Calibri" w:eastAsia="Calibri" w:hAnsi="Calibri"/>
+          <w:sz w:val="24"/>
+          <w:szCs w:val="24"/>
+        </w:rPr>
+        <w:t xml:space="preserve">    &lt;Button</w:t>
+      </w:r>
+    </w:p>
+    <w:p>
+      <w:pPr>
+        <w:spacing w:after="0" w:line="276"/>
+      </w:pPr>
+      <w:r>
+        <w:rPr>
+          <w:rFonts w:ascii="Calibri" w:cs="Calibri" w:eastAsia="Calibri" w:hAnsi="Calibri"/>
+          <w:sz w:val="24"/>
+          <w:szCs w:val="24"/>
+        </w:rPr>
+        <w:t xml:space="preserve">        android:id="@+id/btnDate"</w:t>
       </w:r>
     </w:p>
     <w:p>
@@ -5908,397 +6376,488 @@
           <w:sz w:val="24"/>
           <w:szCs w:val="24"/>
         </w:rPr>
-        <w:t xml:space="preserve">        android:gravity="center_horizontal"</w:t>
-      </w:r>
-    </w:p>
-    <w:p>
-      <w:pPr>
-        <w:spacing w:after="0" w:line="276"/>
-      </w:pPr>
-      <w:r>
-        <w:rPr>
-          <w:rFonts w:ascii="Calibri" w:cs="Calibri" w:eastAsia="Calibri" w:hAnsi="Calibri"/>
-          <w:sz w:val="24"/>
-          <w:szCs w:val="24"/>
-        </w:rPr>
-        <w:t xml:space="preserve">        android:orientation="vertical"</w:t>
-      </w:r>
-    </w:p>
-    <w:p>
-      <w:pPr>
-        <w:spacing w:after="0" w:line="276"/>
-      </w:pPr>
-      <w:r>
-        <w:rPr>
-          <w:rFonts w:ascii="Calibri" w:cs="Calibri" w:eastAsia="Calibri" w:hAnsi="Calibri"/>
-          <w:sz w:val="24"/>
-          <w:szCs w:val="24"/>
-        </w:rPr>
-        <w:t xml:space="preserve">        android:padding="16dp"&gt;</w:t>
-      </w:r>
-    </w:p>
-    <w:p>
-      <w:pPr>
-        <w:spacing w:after="0" w:line="276"/>
-      </w:pPr>
-      <w:r>
-        <w:rPr>
-          <w:rFonts w:ascii="Calibri" w:cs="Calibri" w:eastAsia="Calibri" w:hAnsi="Calibri"/>
-          <w:sz w:val="24"/>
-          <w:szCs w:val="24"/>
-        </w:rPr>
-        <w:t xml:space="preserve"/>
-      </w:r>
-    </w:p>
-    <w:p>
-      <w:pPr>
-        <w:spacing w:after="0" w:line="276"/>
-      </w:pPr>
-      <w:r>
-        <w:rPr>
-          <w:rFonts w:ascii="Calibri" w:cs="Calibri" w:eastAsia="Calibri" w:hAnsi="Calibri"/>
-          <w:sz w:val="24"/>
-          <w:szCs w:val="24"/>
-        </w:rPr>
-        <w:t xml:space="preserve">        &lt;DatePicker</w:t>
-      </w:r>
-    </w:p>
-    <w:p>
-      <w:pPr>
-        <w:spacing w:after="0" w:line="276"/>
-      </w:pPr>
-      <w:r>
-        <w:rPr>
-          <w:rFonts w:ascii="Calibri" w:cs="Calibri" w:eastAsia="Calibri" w:hAnsi="Calibri"/>
-          <w:sz w:val="24"/>
-          <w:szCs w:val="24"/>
-        </w:rPr>
-        <w:t xml:space="preserve">            android:id="@+id/datePicker"</w:t>
-      </w:r>
-    </w:p>
-    <w:p>
-      <w:pPr>
-        <w:spacing w:after="0" w:line="276"/>
-      </w:pPr>
-      <w:r>
-        <w:rPr>
-          <w:rFonts w:ascii="Calibri" w:cs="Calibri" w:eastAsia="Calibri" w:hAnsi="Calibri"/>
-          <w:sz w:val="24"/>
-          <w:szCs w:val="24"/>
-        </w:rPr>
-        <w:t xml:space="preserve">            android:layout_width="wrap_content"</w:t>
-      </w:r>
-    </w:p>
-    <w:p>
-      <w:pPr>
-        <w:spacing w:after="0" w:line="276"/>
-      </w:pPr>
-      <w:r>
-        <w:rPr>
-          <w:rFonts w:ascii="Calibri" w:cs="Calibri" w:eastAsia="Calibri" w:hAnsi="Calibri"/>
-          <w:sz w:val="24"/>
-          <w:szCs w:val="24"/>
-        </w:rPr>
-        <w:t xml:space="preserve">            android:layout_height="wrap_content"</w:t>
-      </w:r>
-    </w:p>
-    <w:p>
-      <w:pPr>
-        <w:spacing w:after="0" w:line="276"/>
-      </w:pPr>
-      <w:r>
-        <w:rPr>
-          <w:rFonts w:ascii="Calibri" w:cs="Calibri" w:eastAsia="Calibri" w:hAnsi="Calibri"/>
-          <w:sz w:val="24"/>
-          <w:szCs w:val="24"/>
-        </w:rPr>
-        <w:t xml:space="preserve">            android:calendarViewShown="false"</w:t>
-      </w:r>
-    </w:p>
-    <w:p>
-      <w:pPr>
-        <w:spacing w:after="0" w:line="276"/>
-      </w:pPr>
-      <w:r>
-        <w:rPr>
-          <w:rFonts w:ascii="Calibri" w:cs="Calibri" w:eastAsia="Calibri" w:hAnsi="Calibri"/>
-          <w:sz w:val="24"/>
-          <w:szCs w:val="24"/>
-        </w:rPr>
-        <w:t xml:space="preserve">            android:datePickerMode="spinner" /&gt;</w:t>
-      </w:r>
-    </w:p>
-    <w:p>
-      <w:pPr>
-        <w:spacing w:after="0" w:line="276"/>
-      </w:pPr>
-      <w:r>
-        <w:rPr>
-          <w:rFonts w:ascii="Calibri" w:cs="Calibri" w:eastAsia="Calibri" w:hAnsi="Calibri"/>
-          <w:sz w:val="24"/>
-          <w:szCs w:val="24"/>
-        </w:rPr>
-        <w:t xml:space="preserve"/>
-      </w:r>
-    </w:p>
-    <w:p>
-      <w:pPr>
-        <w:spacing w:after="0" w:line="276"/>
-      </w:pPr>
-      <w:r>
-        <w:rPr>
-          <w:rFonts w:ascii="Calibri" w:cs="Calibri" w:eastAsia="Calibri" w:hAnsi="Calibri"/>
-          <w:sz w:val="24"/>
-          <w:szCs w:val="24"/>
-        </w:rPr>
-        <w:t xml:space="preserve">        &lt;TimePicker</w:t>
-      </w:r>
-    </w:p>
-    <w:p>
-      <w:pPr>
-        <w:spacing w:after="0" w:line="276"/>
-      </w:pPr>
-      <w:r>
-        <w:rPr>
-          <w:rFonts w:ascii="Calibri" w:cs="Calibri" w:eastAsia="Calibri" w:hAnsi="Calibri"/>
-          <w:sz w:val="24"/>
-          <w:szCs w:val="24"/>
-        </w:rPr>
-        <w:t xml:space="preserve">            android:id="@+id/timePicker"</w:t>
-      </w:r>
-    </w:p>
-    <w:p>
-      <w:pPr>
-        <w:spacing w:after="0" w:line="276"/>
-      </w:pPr>
-      <w:r>
-        <w:rPr>
-          <w:rFonts w:ascii="Calibri" w:cs="Calibri" w:eastAsia="Calibri" w:hAnsi="Calibri"/>
-          <w:sz w:val="24"/>
-          <w:szCs w:val="24"/>
-        </w:rPr>
-        <w:t xml:space="preserve">            android:layout_width="wrap_content"</w:t>
-      </w:r>
-    </w:p>
-    <w:p>
-      <w:pPr>
-        <w:spacing w:after="0" w:line="276"/>
-      </w:pPr>
-      <w:r>
-        <w:rPr>
-          <w:rFonts w:ascii="Calibri" w:cs="Calibri" w:eastAsia="Calibri" w:hAnsi="Calibri"/>
-          <w:sz w:val="24"/>
-          <w:szCs w:val="24"/>
-        </w:rPr>
-        <w:t xml:space="preserve">            android:layout_height="wrap_content"</w:t>
-      </w:r>
-    </w:p>
-    <w:p>
-      <w:pPr>
-        <w:spacing w:after="0" w:line="276"/>
-      </w:pPr>
-      <w:r>
-        <w:rPr>
-          <w:rFonts w:ascii="Calibri" w:cs="Calibri" w:eastAsia="Calibri" w:hAnsi="Calibri"/>
-          <w:sz w:val="24"/>
-          <w:szCs w:val="24"/>
-        </w:rPr>
-        <w:t xml:space="preserve">            android:timePickerMode="spinner" /&gt;</w:t>
-      </w:r>
-    </w:p>
-    <w:p>
-      <w:pPr>
-        <w:spacing w:after="0" w:line="276"/>
-      </w:pPr>
-      <w:r>
-        <w:rPr>
-          <w:rFonts w:ascii="Calibri" w:cs="Calibri" w:eastAsia="Calibri" w:hAnsi="Calibri"/>
-          <w:sz w:val="24"/>
-          <w:szCs w:val="24"/>
-        </w:rPr>
-        <w:t xml:space="preserve"/>
-      </w:r>
-    </w:p>
-    <w:p>
-      <w:pPr>
-        <w:spacing w:after="0" w:line="276"/>
-      </w:pPr>
-      <w:r>
-        <w:rPr>
-          <w:rFonts w:ascii="Calibri" w:cs="Calibri" w:eastAsia="Calibri" w:hAnsi="Calibri"/>
-          <w:sz w:val="24"/>
-          <w:szCs w:val="24"/>
-        </w:rPr>
-        <w:t xml:space="preserve">        &lt;Button</w:t>
-      </w:r>
-    </w:p>
-    <w:p>
-      <w:pPr>
-        <w:spacing w:after="0" w:line="276"/>
-      </w:pPr>
-      <w:r>
-        <w:rPr>
-          <w:rFonts w:ascii="Calibri" w:cs="Calibri" w:eastAsia="Calibri" w:hAnsi="Calibri"/>
-          <w:sz w:val="24"/>
-          <w:szCs w:val="24"/>
-        </w:rPr>
-        <w:t xml:space="preserve">            android:id="@+id/btnShow"</w:t>
-      </w:r>
-    </w:p>
-    <w:p>
-      <w:pPr>
-        <w:spacing w:after="0" w:line="276"/>
-      </w:pPr>
-      <w:r>
-        <w:rPr>
-          <w:rFonts w:ascii="Calibri" w:cs="Calibri" w:eastAsia="Calibri" w:hAnsi="Calibri"/>
-          <w:sz w:val="24"/>
-          <w:szCs w:val="24"/>
-        </w:rPr>
-        <w:t xml:space="preserve">            android:layout_width="wrap_content"</w:t>
-      </w:r>
-    </w:p>
-    <w:p>
-      <w:pPr>
-        <w:spacing w:after="0" w:line="276"/>
-      </w:pPr>
-      <w:r>
-        <w:rPr>
-          <w:rFonts w:ascii="Calibri" w:cs="Calibri" w:eastAsia="Calibri" w:hAnsi="Calibri"/>
-          <w:sz w:val="24"/>
-          <w:szCs w:val="24"/>
-        </w:rPr>
-        <w:t xml:space="preserve">            android:layout_height="wrap_content"</w:t>
-      </w:r>
-    </w:p>
-    <w:p>
-      <w:pPr>
-        <w:spacing w:after="0" w:line="276"/>
-      </w:pPr>
-      <w:r>
-        <w:rPr>
-          <w:rFonts w:ascii="Calibri" w:cs="Calibri" w:eastAsia="Calibri" w:hAnsi="Calibri"/>
-          <w:sz w:val="24"/>
-          <w:szCs w:val="24"/>
-        </w:rPr>
-        <w:t xml:space="preserve">            android:text="Show Date and Time" /&gt;</w:t>
-      </w:r>
-    </w:p>
-    <w:p>
-      <w:pPr>
-        <w:spacing w:after="0" w:line="276"/>
-      </w:pPr>
-      <w:r>
-        <w:rPr>
-          <w:rFonts w:ascii="Calibri" w:cs="Calibri" w:eastAsia="Calibri" w:hAnsi="Calibri"/>
-          <w:sz w:val="24"/>
-          <w:szCs w:val="24"/>
-        </w:rPr>
-        <w:t xml:space="preserve"/>
-      </w:r>
-    </w:p>
-    <w:p>
-      <w:pPr>
-        <w:spacing w:after="0" w:line="276"/>
-      </w:pPr>
-      <w:r>
-        <w:rPr>
-          <w:rFonts w:ascii="Calibri" w:cs="Calibri" w:eastAsia="Calibri" w:hAnsi="Calibri"/>
-          <w:sz w:val="24"/>
-          <w:szCs w:val="24"/>
-        </w:rPr>
-        <w:t xml:space="preserve">        &lt;TextView</w:t>
-      </w:r>
-    </w:p>
-    <w:p>
-      <w:pPr>
-        <w:spacing w:after="0" w:line="276"/>
-      </w:pPr>
-      <w:r>
-        <w:rPr>
-          <w:rFonts w:ascii="Calibri" w:cs="Calibri" w:eastAsia="Calibri" w:hAnsi="Calibri"/>
-          <w:sz w:val="24"/>
-          <w:szCs w:val="24"/>
-        </w:rPr>
-        <w:t xml:space="preserve">            android:id="@+id/tvResult"</w:t>
-      </w:r>
-    </w:p>
-    <w:p>
-      <w:pPr>
-        <w:spacing w:after="0" w:line="276"/>
-      </w:pPr>
-      <w:r>
-        <w:rPr>
-          <w:rFonts w:ascii="Calibri" w:cs="Calibri" w:eastAsia="Calibri" w:hAnsi="Calibri"/>
-          <w:sz w:val="24"/>
-          <w:szCs w:val="24"/>
-        </w:rPr>
-        <w:t xml:space="preserve">            android:layout_width="wrap_content"</w:t>
-      </w:r>
-    </w:p>
-    <w:p>
-      <w:pPr>
-        <w:spacing w:after="0" w:line="276"/>
-      </w:pPr>
-      <w:r>
-        <w:rPr>
-          <w:rFonts w:ascii="Calibri" w:cs="Calibri" w:eastAsia="Calibri" w:hAnsi="Calibri"/>
-          <w:sz w:val="24"/>
-          <w:szCs w:val="24"/>
-        </w:rPr>
-        <w:t xml:space="preserve">            android:layout_height="wrap_content"</w:t>
-      </w:r>
-    </w:p>
-    <w:p>
-      <w:pPr>
-        <w:spacing w:after="0" w:line="276"/>
-      </w:pPr>
-      <w:r>
-        <w:rPr>
-          <w:rFonts w:ascii="Calibri" w:cs="Calibri" w:eastAsia="Calibri" w:hAnsi="Calibri"/>
-          <w:sz w:val="24"/>
-          <w:szCs w:val="24"/>
-        </w:rPr>
-        <w:t xml:space="preserve">            android:layout_marginTop="16dp"</w:t>
-      </w:r>
-    </w:p>
-    <w:p>
-      <w:pPr>
-        <w:spacing w:after="0" w:line="276"/>
-      </w:pPr>
-      <w:r>
-        <w:rPr>
-          <w:rFonts w:ascii="Calibri" w:cs="Calibri" w:eastAsia="Calibri" w:hAnsi="Calibri"/>
-          <w:sz w:val="24"/>
-          <w:szCs w:val="24"/>
-        </w:rPr>
-        <w:t xml:space="preserve">            android:textSize="18sp" /&gt;</w:t>
-      </w:r>
-    </w:p>
-    <w:p>
-      <w:pPr>
-        <w:spacing w:after="0" w:line="276"/>
-      </w:pPr>
-      <w:r>
-        <w:rPr>
-          <w:rFonts w:ascii="Calibri" w:cs="Calibri" w:eastAsia="Calibri" w:hAnsi="Calibri"/>
-          <w:sz w:val="24"/>
-          <w:szCs w:val="24"/>
-        </w:rPr>
-        <w:t xml:space="preserve">    &lt;/LinearLayout&gt;</w:t>
-      </w:r>
-    </w:p>
-    <w:p>
-      <w:pPr>
-        <w:spacing w:after="0" w:line="276"/>
-      </w:pPr>
-      <w:r>
-        <w:rPr>
-          <w:rFonts w:ascii="Calibri" w:cs="Calibri" w:eastAsia="Calibri" w:hAnsi="Calibri"/>
-          <w:sz w:val="24"/>
-          <w:szCs w:val="24"/>
-        </w:rPr>
-        <w:t xml:space="preserve">&lt;/ScrollView&gt;</w:t>
+        <w:t xml:space="preserve">        android:text="Select Date" /&gt;</w:t>
+      </w:r>
+    </w:p>
+    <w:p>
+      <w:pPr>
+        <w:spacing w:after="0" w:line="276"/>
+      </w:pPr>
+      <w:r>
+        <w:rPr>
+          <w:rFonts w:ascii="Calibri" w:cs="Calibri" w:eastAsia="Calibri" w:hAnsi="Calibri"/>
+          <w:sz w:val="24"/>
+          <w:szCs w:val="24"/>
+        </w:rPr>
+        <w:t xml:space="preserve"/>
+      </w:r>
+    </w:p>
+    <w:p>
+      <w:pPr>
+        <w:spacing w:after="0" w:line="276"/>
+      </w:pPr>
+      <w:r>
+        <w:rPr>
+          <w:rFonts w:ascii="Calibri" w:cs="Calibri" w:eastAsia="Calibri" w:hAnsi="Calibri"/>
+          <w:sz w:val="24"/>
+          <w:szCs w:val="24"/>
+        </w:rPr>
+        <w:t xml:space="preserve">    &lt;TextView</w:t>
+      </w:r>
+    </w:p>
+    <w:p>
+      <w:pPr>
+        <w:spacing w:after="0" w:line="276"/>
+      </w:pPr>
+      <w:r>
+        <w:rPr>
+          <w:rFonts w:ascii="Calibri" w:cs="Calibri" w:eastAsia="Calibri" w:hAnsi="Calibri"/>
+          <w:sz w:val="24"/>
+          <w:szCs w:val="24"/>
+        </w:rPr>
+        <w:t xml:space="preserve">        android:id="@+id/tvDate"</w:t>
+      </w:r>
+    </w:p>
+    <w:p>
+      <w:pPr>
+        <w:spacing w:after="0" w:line="276"/>
+      </w:pPr>
+      <w:r>
+        <w:rPr>
+          <w:rFonts w:ascii="Calibri" w:cs="Calibri" w:eastAsia="Calibri" w:hAnsi="Calibri"/>
+          <w:sz w:val="24"/>
+          <w:szCs w:val="24"/>
+        </w:rPr>
+        <w:t xml:space="preserve">        android:layout_width="match_parent"</w:t>
+      </w:r>
+    </w:p>
+    <w:p>
+      <w:pPr>
+        <w:spacing w:after="0" w:line="276"/>
+      </w:pPr>
+      <w:r>
+        <w:rPr>
+          <w:rFonts w:ascii="Calibri" w:cs="Calibri" w:eastAsia="Calibri" w:hAnsi="Calibri"/>
+          <w:sz w:val="24"/>
+          <w:szCs w:val="24"/>
+        </w:rPr>
+        <w:t xml:space="preserve">        android:layout_height="wrap_content"</w:t>
+      </w:r>
+    </w:p>
+    <w:p>
+      <w:pPr>
+        <w:spacing w:after="0" w:line="276"/>
+      </w:pPr>
+      <w:r>
+        <w:rPr>
+          <w:rFonts w:ascii="Calibri" w:cs="Calibri" w:eastAsia="Calibri" w:hAnsi="Calibri"/>
+          <w:sz w:val="24"/>
+          <w:szCs w:val="24"/>
+        </w:rPr>
+        <w:t xml:space="preserve">        android:padding="8dp"</w:t>
+      </w:r>
+    </w:p>
+    <w:p>
+      <w:pPr>
+        <w:spacing w:after="0" w:line="276"/>
+      </w:pPr>
+      <w:r>
+        <w:rPr>
+          <w:rFonts w:ascii="Calibri" w:cs="Calibri" w:eastAsia="Calibri" w:hAnsi="Calibri"/>
+          <w:sz w:val="24"/>
+          <w:szCs w:val="24"/>
+        </w:rPr>
+        <w:t xml:space="preserve">        android:text="Date: not selected"</w:t>
+      </w:r>
+    </w:p>
+    <w:p>
+      <w:pPr>
+        <w:spacing w:after="0" w:line="276"/>
+      </w:pPr>
+      <w:r>
+        <w:rPr>
+          <w:rFonts w:ascii="Calibri" w:cs="Calibri" w:eastAsia="Calibri" w:hAnsi="Calibri"/>
+          <w:sz w:val="24"/>
+          <w:szCs w:val="24"/>
+        </w:rPr>
+        <w:t xml:space="preserve">        android:textSize="16sp" /&gt;</w:t>
+      </w:r>
+    </w:p>
+    <w:p>
+      <w:pPr>
+        <w:spacing w:after="0" w:line="276"/>
+      </w:pPr>
+      <w:r>
+        <w:rPr>
+          <w:rFonts w:ascii="Calibri" w:cs="Calibri" w:eastAsia="Calibri" w:hAnsi="Calibri"/>
+          <w:sz w:val="24"/>
+          <w:szCs w:val="24"/>
+        </w:rPr>
+        <w:t xml:space="preserve"/>
+      </w:r>
+    </w:p>
+    <w:p>
+      <w:pPr>
+        <w:spacing w:after="0" w:line="276"/>
+      </w:pPr>
+      <w:r>
+        <w:rPr>
+          <w:rFonts w:ascii="Calibri" w:cs="Calibri" w:eastAsia="Calibri" w:hAnsi="Calibri"/>
+          <w:sz w:val="24"/>
+          <w:szCs w:val="24"/>
+        </w:rPr>
+        <w:t xml:space="preserve">    &lt;Button</w:t>
+      </w:r>
+    </w:p>
+    <w:p>
+      <w:pPr>
+        <w:spacing w:after="0" w:line="276"/>
+      </w:pPr>
+      <w:r>
+        <w:rPr>
+          <w:rFonts w:ascii="Calibri" w:cs="Calibri" w:eastAsia="Calibri" w:hAnsi="Calibri"/>
+          <w:sz w:val="24"/>
+          <w:szCs w:val="24"/>
+        </w:rPr>
+        <w:t xml:space="preserve">        android:id="@+id/btnTime"</w:t>
+      </w:r>
+    </w:p>
+    <w:p>
+      <w:pPr>
+        <w:spacing w:after="0" w:line="276"/>
+      </w:pPr>
+      <w:r>
+        <w:rPr>
+          <w:rFonts w:ascii="Calibri" w:cs="Calibri" w:eastAsia="Calibri" w:hAnsi="Calibri"/>
+          <w:sz w:val="24"/>
+          <w:szCs w:val="24"/>
+        </w:rPr>
+        <w:t xml:space="preserve">        android:layout_width="match_parent"</w:t>
+      </w:r>
+    </w:p>
+    <w:p>
+      <w:pPr>
+        <w:spacing w:after="0" w:line="276"/>
+      </w:pPr>
+      <w:r>
+        <w:rPr>
+          <w:rFonts w:ascii="Calibri" w:cs="Calibri" w:eastAsia="Calibri" w:hAnsi="Calibri"/>
+          <w:sz w:val="24"/>
+          <w:szCs w:val="24"/>
+        </w:rPr>
+        <w:t xml:space="preserve">        android:layout_height="wrap_content"</w:t>
+      </w:r>
+    </w:p>
+    <w:p>
+      <w:pPr>
+        <w:spacing w:after="0" w:line="276"/>
+      </w:pPr>
+      <w:r>
+        <w:rPr>
+          <w:rFonts w:ascii="Calibri" w:cs="Calibri" w:eastAsia="Calibri" w:hAnsi="Calibri"/>
+          <w:sz w:val="24"/>
+          <w:szCs w:val="24"/>
+        </w:rPr>
+        <w:t xml:space="preserve">        android:text="Select Time" /&gt;</w:t>
+      </w:r>
+    </w:p>
+    <w:p>
+      <w:pPr>
+        <w:spacing w:after="0" w:line="276"/>
+      </w:pPr>
+      <w:r>
+        <w:rPr>
+          <w:rFonts w:ascii="Calibri" w:cs="Calibri" w:eastAsia="Calibri" w:hAnsi="Calibri"/>
+          <w:sz w:val="24"/>
+          <w:szCs w:val="24"/>
+        </w:rPr>
+        <w:t xml:space="preserve"/>
+      </w:r>
+    </w:p>
+    <w:p>
+      <w:pPr>
+        <w:spacing w:after="0" w:line="276"/>
+      </w:pPr>
+      <w:r>
+        <w:rPr>
+          <w:rFonts w:ascii="Calibri" w:cs="Calibri" w:eastAsia="Calibri" w:hAnsi="Calibri"/>
+          <w:sz w:val="24"/>
+          <w:szCs w:val="24"/>
+        </w:rPr>
+        <w:t xml:space="preserve">    &lt;TextView</w:t>
+      </w:r>
+    </w:p>
+    <w:p>
+      <w:pPr>
+        <w:spacing w:after="0" w:line="276"/>
+      </w:pPr>
+      <w:r>
+        <w:rPr>
+          <w:rFonts w:ascii="Calibri" w:cs="Calibri" w:eastAsia="Calibri" w:hAnsi="Calibri"/>
+          <w:sz w:val="24"/>
+          <w:szCs w:val="24"/>
+        </w:rPr>
+        <w:t xml:space="preserve">        android:id="@+id/tvTime"</w:t>
+      </w:r>
+    </w:p>
+    <w:p>
+      <w:pPr>
+        <w:spacing w:after="0" w:line="276"/>
+      </w:pPr>
+      <w:r>
+        <w:rPr>
+          <w:rFonts w:ascii="Calibri" w:cs="Calibri" w:eastAsia="Calibri" w:hAnsi="Calibri"/>
+          <w:sz w:val="24"/>
+          <w:szCs w:val="24"/>
+        </w:rPr>
+        <w:t xml:space="preserve">        android:layout_width="match_parent"</w:t>
+      </w:r>
+    </w:p>
+    <w:p>
+      <w:pPr>
+        <w:spacing w:after="0" w:line="276"/>
+      </w:pPr>
+      <w:r>
+        <w:rPr>
+          <w:rFonts w:ascii="Calibri" w:cs="Calibri" w:eastAsia="Calibri" w:hAnsi="Calibri"/>
+          <w:sz w:val="24"/>
+          <w:szCs w:val="24"/>
+        </w:rPr>
+        <w:t xml:space="preserve">        android:layout_height="wrap_content"</w:t>
+      </w:r>
+    </w:p>
+    <w:p>
+      <w:pPr>
+        <w:spacing w:after="0" w:line="276"/>
+      </w:pPr>
+      <w:r>
+        <w:rPr>
+          <w:rFonts w:ascii="Calibri" w:cs="Calibri" w:eastAsia="Calibri" w:hAnsi="Calibri"/>
+          <w:sz w:val="24"/>
+          <w:szCs w:val="24"/>
+        </w:rPr>
+        <w:t xml:space="preserve">        android:padding="8dp"</w:t>
+      </w:r>
+    </w:p>
+    <w:p>
+      <w:pPr>
+        <w:spacing w:after="0" w:line="276"/>
+      </w:pPr>
+      <w:r>
+        <w:rPr>
+          <w:rFonts w:ascii="Calibri" w:cs="Calibri" w:eastAsia="Calibri" w:hAnsi="Calibri"/>
+          <w:sz w:val="24"/>
+          <w:szCs w:val="24"/>
+        </w:rPr>
+        <w:t xml:space="preserve">        android:text="Time: not selected"</w:t>
+      </w:r>
+    </w:p>
+    <w:p>
+      <w:pPr>
+        <w:spacing w:after="0" w:line="276"/>
+      </w:pPr>
+      <w:r>
+        <w:rPr>
+          <w:rFonts w:ascii="Calibri" w:cs="Calibri" w:eastAsia="Calibri" w:hAnsi="Calibri"/>
+          <w:sz w:val="24"/>
+          <w:szCs w:val="24"/>
+        </w:rPr>
+        <w:t xml:space="preserve">        android:textSize="16sp" /&gt;</w:t>
+      </w:r>
+    </w:p>
+    <w:p>
+      <w:pPr>
+        <w:spacing w:after="0" w:line="276"/>
+      </w:pPr>
+      <w:r>
+        <w:rPr>
+          <w:rFonts w:ascii="Calibri" w:cs="Calibri" w:eastAsia="Calibri" w:hAnsi="Calibri"/>
+          <w:sz w:val="24"/>
+          <w:szCs w:val="24"/>
+        </w:rPr>
+        <w:t xml:space="preserve"/>
+      </w:r>
+    </w:p>
+    <w:p>
+      <w:pPr>
+        <w:spacing w:after="0" w:line="276"/>
+      </w:pPr>
+      <w:r>
+        <w:rPr>
+          <w:rFonts w:ascii="Calibri" w:cs="Calibri" w:eastAsia="Calibri" w:hAnsi="Calibri"/>
+          <w:sz w:val="24"/>
+          <w:szCs w:val="24"/>
+        </w:rPr>
+        <w:t xml:space="preserve">    &lt;Button</w:t>
+      </w:r>
+    </w:p>
+    <w:p>
+      <w:pPr>
+        <w:spacing w:after="0" w:line="276"/>
+      </w:pPr>
+      <w:r>
+        <w:rPr>
+          <w:rFonts w:ascii="Calibri" w:cs="Calibri" w:eastAsia="Calibri" w:hAnsi="Calibri"/>
+          <w:sz w:val="24"/>
+          <w:szCs w:val="24"/>
+        </w:rPr>
+        <w:t xml:space="preserve">        android:id="@+id/btnShow"</w:t>
+      </w:r>
+    </w:p>
+    <w:p>
+      <w:pPr>
+        <w:spacing w:after="0" w:line="276"/>
+      </w:pPr>
+      <w:r>
+        <w:rPr>
+          <w:rFonts w:ascii="Calibri" w:cs="Calibri" w:eastAsia="Calibri" w:hAnsi="Calibri"/>
+          <w:sz w:val="24"/>
+          <w:szCs w:val="24"/>
+        </w:rPr>
+        <w:t xml:space="preserve">        android:layout_width="match_parent"</w:t>
+      </w:r>
+    </w:p>
+    <w:p>
+      <w:pPr>
+        <w:spacing w:after="0" w:line="276"/>
+      </w:pPr>
+      <w:r>
+        <w:rPr>
+          <w:rFonts w:ascii="Calibri" w:cs="Calibri" w:eastAsia="Calibri" w:hAnsi="Calibri"/>
+          <w:sz w:val="24"/>
+          <w:szCs w:val="24"/>
+        </w:rPr>
+        <w:t xml:space="preserve">        android:layout_height="wrap_content"</w:t>
+      </w:r>
+    </w:p>
+    <w:p>
+      <w:pPr>
+        <w:spacing w:after="0" w:line="276"/>
+      </w:pPr>
+      <w:r>
+        <w:rPr>
+          <w:rFonts w:ascii="Calibri" w:cs="Calibri" w:eastAsia="Calibri" w:hAnsi="Calibri"/>
+          <w:sz w:val="24"/>
+          <w:szCs w:val="24"/>
+        </w:rPr>
+        <w:t xml:space="preserve">        android:layout_marginTop="16dp"</w:t>
+      </w:r>
+    </w:p>
+    <w:p>
+      <w:pPr>
+        <w:spacing w:after="0" w:line="276"/>
+      </w:pPr>
+      <w:r>
+        <w:rPr>
+          <w:rFonts w:ascii="Calibri" w:cs="Calibri" w:eastAsia="Calibri" w:hAnsi="Calibri"/>
+          <w:sz w:val="24"/>
+          <w:szCs w:val="24"/>
+        </w:rPr>
+        <w:t xml:space="preserve">        android:text="Show Date and Time" /&gt;</w:t>
+      </w:r>
+    </w:p>
+    <w:p>
+      <w:pPr>
+        <w:spacing w:after="0" w:line="276"/>
+      </w:pPr>
+      <w:r>
+        <w:rPr>
+          <w:rFonts w:ascii="Calibri" w:cs="Calibri" w:eastAsia="Calibri" w:hAnsi="Calibri"/>
+          <w:sz w:val="24"/>
+          <w:szCs w:val="24"/>
+        </w:rPr>
+        <w:t xml:space="preserve"/>
+      </w:r>
+    </w:p>
+    <w:p>
+      <w:pPr>
+        <w:spacing w:after="0" w:line="276"/>
+      </w:pPr>
+      <w:r>
+        <w:rPr>
+          <w:rFonts w:ascii="Calibri" w:cs="Calibri" w:eastAsia="Calibri" w:hAnsi="Calibri"/>
+          <w:sz w:val="24"/>
+          <w:szCs w:val="24"/>
+        </w:rPr>
+        <w:t xml:space="preserve">    &lt;TextView</w:t>
+      </w:r>
+    </w:p>
+    <w:p>
+      <w:pPr>
+        <w:spacing w:after="0" w:line="276"/>
+      </w:pPr>
+      <w:r>
+        <w:rPr>
+          <w:rFonts w:ascii="Calibri" w:cs="Calibri" w:eastAsia="Calibri" w:hAnsi="Calibri"/>
+          <w:sz w:val="24"/>
+          <w:szCs w:val="24"/>
+        </w:rPr>
+        <w:t xml:space="preserve">        android:id="@+id/tvResult"</w:t>
+      </w:r>
+    </w:p>
+    <w:p>
+      <w:pPr>
+        <w:spacing w:after="0" w:line="276"/>
+      </w:pPr>
+      <w:r>
+        <w:rPr>
+          <w:rFonts w:ascii="Calibri" w:cs="Calibri" w:eastAsia="Calibri" w:hAnsi="Calibri"/>
+          <w:sz w:val="24"/>
+          <w:szCs w:val="24"/>
+        </w:rPr>
+        <w:t xml:space="preserve">        android:layout_width="match_parent"</w:t>
+      </w:r>
+    </w:p>
+    <w:p>
+      <w:pPr>
+        <w:spacing w:after="0" w:line="276"/>
+      </w:pPr>
+      <w:r>
+        <w:rPr>
+          <w:rFonts w:ascii="Calibri" w:cs="Calibri" w:eastAsia="Calibri" w:hAnsi="Calibri"/>
+          <w:sz w:val="24"/>
+          <w:szCs w:val="24"/>
+        </w:rPr>
+        <w:t xml:space="preserve">        android:layout_height="wrap_content"</w:t>
+      </w:r>
+    </w:p>
+    <w:p>
+      <w:pPr>
+        <w:spacing w:after="0" w:line="276"/>
+      </w:pPr>
+      <w:r>
+        <w:rPr>
+          <w:rFonts w:ascii="Calibri" w:cs="Calibri" w:eastAsia="Calibri" w:hAnsi="Calibri"/>
+          <w:sz w:val="24"/>
+          <w:szCs w:val="24"/>
+        </w:rPr>
+        <w:t xml:space="preserve">        android:layout_marginTop="16dp"</w:t>
+      </w:r>
+    </w:p>
+    <w:p>
+      <w:pPr>
+        <w:spacing w:after="0" w:line="276"/>
+      </w:pPr>
+      <w:r>
+        <w:rPr>
+          <w:rFonts w:ascii="Calibri" w:cs="Calibri" w:eastAsia="Calibri" w:hAnsi="Calibri"/>
+          <w:sz w:val="24"/>
+          <w:szCs w:val="24"/>
+        </w:rPr>
+        <w:t xml:space="preserve">        android:textSize="18sp" /&gt;</w:t>
+      </w:r>
+    </w:p>
+    <w:p>
+      <w:pPr>
+        <w:spacing w:after="0" w:line="276"/>
+      </w:pPr>
+      <w:r>
+        <w:rPr>
+          <w:rFonts w:ascii="Calibri" w:cs="Calibri" w:eastAsia="Calibri" w:hAnsi="Calibri"/>
+          <w:sz w:val="24"/>
+          <w:szCs w:val="24"/>
+        </w:rPr>
+        <w:t xml:space="preserve">&lt;/LinearLayout&gt;</w:t>
       </w:r>
     </w:p>
     <w:p>
@@ -6340,8 +6899,9 @@
         </w:tblBorders>
       </w:tblPr>
       <w:tblGrid>
-        <w:gridCol w:w="4800"/>
-        <w:gridCol w:w="4800"/>
+        <w:gridCol w:w="3200"/>
+        <w:gridCol w:w="3200"/>
+        <w:gridCol w:w="3200"/>
       </w:tblGrid>
       <w:tr>
         <w:trPr>
@@ -6349,7 +6909,7 @@
         </w:trPr>
         <w:tc>
           <w:tcPr>
-            <w:tcW w:type="dxa" w:w="4800"/>
+            <w:tcW w:type="dxa" w:w="3200"/>
             <w:tcBorders>
               <w:top w:val="none" w:color="FFFFFF" w:sz="0"/>
               <w:left w:val="none" w:color="FFFFFF" w:sz="0"/>
@@ -6374,7 +6934,7 @@
             <w:r>
               <w:drawing>
                 <wp:inline distT="0" distB="0" distL="0" distR="0">
-                  <wp:extent cx="1619250" cy="3409950"/>
+                  <wp:extent cx="1428750" cy="3009900"/>
                   <wp:effectExtent t="0" r="0" b="0" l="0"/>
                   <wp:docPr id="1" name="q3_1" descr="1. App launched" title="Q3"/>
                   <wp:cNvGraphicFramePr>
@@ -6399,7 +6959,7 @@
                         <pic:spPr bwMode="auto">
                           <a:xfrm>
                             <a:off x="0" y="0"/>
-                            <a:ext cx="1619250" cy="3409950"/>
+                            <a:ext cx="1428750" cy="3009900"/>
                           </a:xfrm>
                           <a:prstGeom prst="rect">
                             <a:avLst/>
@@ -6415,7 +6975,7 @@
         </w:tc>
         <w:tc>
           <w:tcPr>
-            <w:tcW w:type="dxa" w:w="4800"/>
+            <w:tcW w:type="dxa" w:w="3200"/>
             <w:tcBorders>
               <w:top w:val="none" w:color="FFFFFF" w:sz="0"/>
               <w:left w:val="none" w:color="FFFFFF" w:sz="0"/>
@@ -6433,16 +6993,16 @@
                 <w:sz w:val="20"/>
                 <w:szCs w:val="20"/>
               </w:rPr>
-              <w:t xml:space="preserve">2. Date selected (15 Aug 2026)</w:t>
+              <w:t xml:space="preserve">2. Select Date pressed (date dialog)</w:t>
             </w:r>
           </w:p>
           <w:p>
             <w:r>
               <w:drawing>
                 <wp:inline distT="0" distB="0" distL="0" distR="0">
-                  <wp:extent cx="1619250" cy="3409950"/>
+                  <wp:extent cx="1428750" cy="3009900"/>
                   <wp:effectExtent t="0" r="0" b="0" l="0"/>
-                  <wp:docPr id="1" name="q3_2" descr="2. Date selected (15 Aug 2026)" title="Q3"/>
+                  <wp:docPr id="1" name="q3_2" descr="2. Select Date pressed (date dialog)" title="Q3"/>
                   <wp:cNvGraphicFramePr>
                     <a:graphicFrameLocks xmlns:a="http://schemas.openxmlformats.org/drawingml/2006/main" noChangeAspect="1"/>
                   </wp:cNvGraphicFramePr>
@@ -6465,7 +7025,7 @@
                         <pic:spPr bwMode="auto">
                           <a:xfrm>
                             <a:off x="0" y="0"/>
-                            <a:ext cx="1619250" cy="3409950"/>
+                            <a:ext cx="1428750" cy="3009900"/>
                           </a:xfrm>
                           <a:prstGeom prst="rect">
                             <a:avLst/>
@@ -6479,14 +7039,9 @@
             </w:r>
           </w:p>
         </w:tc>
-      </w:tr>
-      <w:tr>
-        <w:trPr>
-          <w:cantSplit/>
-        </w:trPr>
         <w:tc>
           <w:tcPr>
-            <w:tcW w:type="dxa" w:w="4800"/>
+            <w:tcW w:type="dxa" w:w="3200"/>
             <w:tcBorders>
               <w:top w:val="none" w:color="FFFFFF" w:sz="0"/>
               <w:left w:val="none" w:color="FFFFFF" w:sz="0"/>
@@ -6504,16 +7059,16 @@
                 <w:sz w:val="20"/>
                 <w:szCs w:val="20"/>
               </w:rPr>
-              <w:t xml:space="preserve">3. Time selected (3:30 PM)</w:t>
+              <w:t xml:space="preserve">3. After pressing OK on date</w:t>
             </w:r>
           </w:p>
           <w:p>
             <w:r>
               <w:drawing>
                 <wp:inline distT="0" distB="0" distL="0" distR="0">
-                  <wp:extent cx="1619250" cy="3409950"/>
+                  <wp:extent cx="1428750" cy="3009900"/>
                   <wp:effectExtent t="0" r="0" b="0" l="0"/>
-                  <wp:docPr id="1" name="q3_3" descr="3. Time selected (3:30 PM)" title="Q3"/>
+                  <wp:docPr id="1" name="q3_3" descr="3. After pressing OK on date" title="Q3"/>
                   <wp:cNvGraphicFramePr>
                     <a:graphicFrameLocks xmlns:a="http://schemas.openxmlformats.org/drawingml/2006/main" noChangeAspect="1"/>
                   </wp:cNvGraphicFramePr>
@@ -6536,7 +7091,7 @@
                         <pic:spPr bwMode="auto">
                           <a:xfrm>
                             <a:off x="0" y="0"/>
-                            <a:ext cx="1619250" cy="3409950"/>
+                            <a:ext cx="1428750" cy="3009900"/>
                           </a:xfrm>
                           <a:prstGeom prst="rect">
                             <a:avLst/>
@@ -6550,9 +7105,14 @@
             </w:r>
           </w:p>
         </w:tc>
+      </w:tr>
+      <w:tr>
+        <w:trPr>
+          <w:cantSplit/>
+        </w:trPr>
         <w:tc>
           <w:tcPr>
-            <w:tcW w:type="dxa" w:w="4800"/>
+            <w:tcW w:type="dxa" w:w="3200"/>
             <w:tcBorders>
               <w:top w:val="none" w:color="FFFFFF" w:sz="0"/>
               <w:left w:val="none" w:color="FFFFFF" w:sz="0"/>
@@ -6570,16 +7130,16 @@
                 <w:sz w:val="20"/>
                 <w:szCs w:val="20"/>
               </w:rPr>
-              <w:t xml:space="preserve">4. After pressing Show Date and Time</w:t>
+              <w:t xml:space="preserve">4. Select Time pressed (time dialog)</w:t>
             </w:r>
           </w:p>
           <w:p>
             <w:r>
               <w:drawing>
                 <wp:inline distT="0" distB="0" distL="0" distR="0">
-                  <wp:extent cx="1619250" cy="3409950"/>
+                  <wp:extent cx="1428750" cy="3009900"/>
                   <wp:effectExtent t="0" r="0" b="0" l="0"/>
-                  <wp:docPr id="1" name="q3_4" descr="4. After pressing Show Date and Time" title="Q3"/>
+                  <wp:docPr id="1" name="q3_4" descr="4. Select Time pressed (time dialog)" title="Q3"/>
                   <wp:cNvGraphicFramePr>
                     <a:graphicFrameLocks xmlns:a="http://schemas.openxmlformats.org/drawingml/2006/main" noChangeAspect="1"/>
                   </wp:cNvGraphicFramePr>
@@ -6602,7 +7162,139 @@
                         <pic:spPr bwMode="auto">
                           <a:xfrm>
                             <a:off x="0" y="0"/>
-                            <a:ext cx="1619250" cy="3409950"/>
+                            <a:ext cx="1428750" cy="3009900"/>
+                          </a:xfrm>
+                          <a:prstGeom prst="rect">
+                            <a:avLst/>
+                          </a:prstGeom>
+                        </pic:spPr>
+                      </pic:pic>
+                    </a:graphicData>
+                  </a:graphic>
+                </wp:inline>
+              </w:drawing>
+            </w:r>
+          </w:p>
+        </w:tc>
+        <w:tc>
+          <w:tcPr>
+            <w:tcW w:type="dxa" w:w="3200"/>
+            <w:tcBorders>
+              <w:top w:val="none" w:color="FFFFFF" w:sz="0"/>
+              <w:left w:val="none" w:color="FFFFFF" w:sz="0"/>
+              <w:bottom w:val="none" w:color="FFFFFF" w:sz="0"/>
+              <w:right w:val="none" w:color="FFFFFF" w:sz="0"/>
+            </w:tcBorders>
+          </w:tcPr>
+          <w:p>
+            <w:pPr>
+              <w:spacing w:after="60" w:before="100"/>
+            </w:pPr>
+            <w:r>
+              <w:rPr>
+                <w:rFonts w:ascii="Calibri" w:cs="Calibri" w:eastAsia="Calibri" w:hAnsi="Calibri"/>
+                <w:sz w:val="20"/>
+                <w:szCs w:val="20"/>
+              </w:rPr>
+              <w:t xml:space="preserve">5. After pressing OK on time</w:t>
+            </w:r>
+          </w:p>
+          <w:p>
+            <w:r>
+              <w:drawing>
+                <wp:inline distT="0" distB="0" distL="0" distR="0">
+                  <wp:extent cx="1428750" cy="3009900"/>
+                  <wp:effectExtent t="0" r="0" b="0" l="0"/>
+                  <wp:docPr id="1" name="q3_5" descr="5. After pressing OK on time" title="Q3"/>
+                  <wp:cNvGraphicFramePr>
+                    <a:graphicFrameLocks xmlns:a="http://schemas.openxmlformats.org/drawingml/2006/main" noChangeAspect="1"/>
+                  </wp:cNvGraphicFramePr>
+                  <a:graphic xmlns:a="http://schemas.openxmlformats.org/drawingml/2006/main">
+                    <a:graphicData uri="http://schemas.openxmlformats.org/drawingml/2006/picture">
+                      <pic:pic xmlns:pic="http://schemas.openxmlformats.org/drawingml/2006/picture">
+                        <pic:nvPicPr>
+                          <pic:cNvPr id="0" name="" descr=""/>
+                          <pic:cNvPicPr>
+                            <a:picLocks noChangeAspect="1" noChangeArrowheads="1"/>
+                          </pic:cNvPicPr>
+                        </pic:nvPicPr>
+                        <pic:blipFill>
+                          <a:blip r:embed="rId17" cstate="none"/>
+                          <a:srcRect/>
+                          <a:stretch>
+                            <a:fillRect/>
+                          </a:stretch>
+                        </pic:blipFill>
+                        <pic:spPr bwMode="auto">
+                          <a:xfrm>
+                            <a:off x="0" y="0"/>
+                            <a:ext cx="1428750" cy="3009900"/>
+                          </a:xfrm>
+                          <a:prstGeom prst="rect">
+                            <a:avLst/>
+                          </a:prstGeom>
+                        </pic:spPr>
+                      </pic:pic>
+                    </a:graphicData>
+                  </a:graphic>
+                </wp:inline>
+              </w:drawing>
+            </w:r>
+          </w:p>
+        </w:tc>
+        <w:tc>
+          <w:tcPr>
+            <w:tcW w:type="dxa" w:w="3200"/>
+            <w:tcBorders>
+              <w:top w:val="none" w:color="FFFFFF" w:sz="0"/>
+              <w:left w:val="none" w:color="FFFFFF" w:sz="0"/>
+              <w:bottom w:val="none" w:color="FFFFFF" w:sz="0"/>
+              <w:right w:val="none" w:color="FFFFFF" w:sz="0"/>
+            </w:tcBorders>
+          </w:tcPr>
+          <w:p>
+            <w:pPr>
+              <w:spacing w:after="60" w:before="100"/>
+            </w:pPr>
+            <w:r>
+              <w:rPr>
+                <w:rFonts w:ascii="Calibri" w:cs="Calibri" w:eastAsia="Calibri" w:hAnsi="Calibri"/>
+                <w:sz w:val="20"/>
+                <w:szCs w:val="20"/>
+              </w:rPr>
+              <w:t xml:space="preserve">6. After pressing Show Date and Time</w:t>
+            </w:r>
+          </w:p>
+          <w:p>
+            <w:r>
+              <w:drawing>
+                <wp:inline distT="0" distB="0" distL="0" distR="0">
+                  <wp:extent cx="1428750" cy="3009900"/>
+                  <wp:effectExtent t="0" r="0" b="0" l="0"/>
+                  <wp:docPr id="1" name="q3_6" descr="6. After pressing Show Date and Time" title="Q3"/>
+                  <wp:cNvGraphicFramePr>
+                    <a:graphicFrameLocks xmlns:a="http://schemas.openxmlformats.org/drawingml/2006/main" noChangeAspect="1"/>
+                  </wp:cNvGraphicFramePr>
+                  <a:graphic xmlns:a="http://schemas.openxmlformats.org/drawingml/2006/main">
+                    <a:graphicData uri="http://schemas.openxmlformats.org/drawingml/2006/picture">
+                      <pic:pic xmlns:pic="http://schemas.openxmlformats.org/drawingml/2006/picture">
+                        <pic:nvPicPr>
+                          <pic:cNvPr id="0" name="" descr=""/>
+                          <pic:cNvPicPr>
+                            <a:picLocks noChangeAspect="1" noChangeArrowheads="1"/>
+                          </pic:cNvPicPr>
+                        </pic:nvPicPr>
+                        <pic:blipFill>
+                          <a:blip r:embed="rId18" cstate="none"/>
+                          <a:srcRect/>
+                          <a:stretch>
+                            <a:fillRect/>
+                          </a:stretch>
+                        </pic:blipFill>
+                        <pic:spPr bwMode="auto">
+                          <a:xfrm>
+                            <a:off x="0" y="0"/>
+                            <a:ext cx="1428750" cy="3009900"/>
                           </a:xfrm>
                           <a:prstGeom prst="rect">
                             <a:avLst/>
@@ -8530,7 +9222,7 @@
                     </pic:cNvPicPr>
                   </pic:nvPicPr>
                   <pic:blipFill>
-                    <a:blip r:embed="rId17" cstate="none"/>
+                    <a:blip r:embed="rId19" cstate="none"/>
                     <a:srcRect/>
                     <a:stretch>
                       <a:fillRect/>

</xml_diff>